<commit_message>
Mejora cobertura de pruebas a 91% combinada, agrega documentos en docs: protocolo TUI v4.2, impacto potencial, lista de pruebas revolucionarias. Actualiza tests para cubrir más ramas.
</commit_message>
<xml_diff>
--- a/docs/Problema 3 .docx
+++ b/docs/Problema 3 .docx
@@ -1762,6 +1762,1811 @@
       </w:r>
       <w:r>
         <w:t xml:space="preserve"> que el agente genere inteligencia (PGF Bruto). La teoría H1 o la formulación del PGF deben ser revisadas, ya que el riesgo excesivo parece suprimir el aprendizaje en lugar de fomentarlo."</w:t>
+      </w:r>
+    </w:p>
+    <w:p/>
+    <w:p/>
+    <w:p/>
+    <w:p>
+      <w:r>
+        <w:t xml:space="preserve">-------------------otros ángulos: </w:t>
+      </w:r>
+    </w:p>
+    <w:p>
+      <w:r>
+        <w:t xml:space="preserve">Título del Experimento: Análisis de la Tensión: Verificación de la Hipótesis H1 bajo </w:t>
+      </w:r>
+      <w:proofErr w:type="spellStart"/>
+      <w:r>
+        <w:t>risk_scale</w:t>
+      </w:r>
+      <w:proofErr w:type="spellEnd"/>
+      <w:r>
+        <w:t xml:space="preserve"> variable.</w:t>
+      </w:r>
+      <w:r>
+        <w:br/>
+        <w:t>Alias: "Resolución del Problema 3 (P3)"</w:t>
+      </w:r>
+      <w:r>
+        <w:br/>
+        <w:t>Investigador Principal: José M. Rivera García 1. Definición del Problema de Investigación</w:t>
+      </w:r>
+      <w:r>
+        <w:br/>
+        <w:t xml:space="preserve">El proyecto TUI v4.1 se enfrenta a una aparente contradicción que debe ser resuelta: </w:t>
+      </w:r>
+    </w:p>
+    <w:p>
+      <w:pPr>
+        <w:numPr>
+          <w:ilvl w:val="0"/>
+          <w:numId w:val="6"/>
+        </w:numPr>
+      </w:pPr>
+      <w:r>
+        <w:t>La Teoría (H1): Nuestra tesis central postula que la inteligencia operativa emerge como función del riesgo acumulado (</w:t>
+      </w:r>
+    </w:p>
+    <w:p>
+      <w:r>
+        <w:fldChar w:fldCharType="begin"/>
+      </w:r>
+      <w:r>
+        <w:instrText xml:space="preserve"> QUOTE </w:instrText>
+      </w:r>
+      <w:r>
+        <w:pict w14:anchorId="6173586D">
+          <v:shapetype id="_x0000_t75" coordsize="21600,21600" o:spt="75" o:preferrelative="t" path="m@4@5l@4@11@9@11@9@5xe" filled="f" stroked="f">
+            <v:stroke joinstyle="miter"/>
+            <v:formulas>
+              <v:f eqn="if lineDrawn pixelLineWidth 0"/>
+              <v:f eqn="sum @0 1 0"/>
+              <v:f eqn="sum 0 0 @1"/>
+              <v:f eqn="prod @2 1 2"/>
+              <v:f eqn="prod @3 21600 pixelWidth"/>
+              <v:f eqn="prod @3 21600 pixelHeight"/>
+              <v:f eqn="sum @0 0 1"/>
+              <v:f eqn="prod @6 1 2"/>
+              <v:f eqn="prod @7 21600 pixelWidth"/>
+              <v:f eqn="sum @8 21600 0"/>
+              <v:f eqn="prod @7 21600 pixelHeight"/>
+              <v:f eqn="sum @10 21600 0"/>
+            </v:formulas>
+            <v:path o:extrusionok="f" gradientshapeok="t" o:connecttype="rect"/>
+            <o:lock v:ext="edit" aspectratio="t"/>
+          </v:shapetype>
+          <v:shape id="_x0000_i1037" type="#_x0000_t75" style="width:47.25pt;height:18pt" equationxml="&lt;?xml version=&quot;1.0&quot; encoding=&quot;UTF-8&quot; standalone=&quot;yes&quot;?&gt;&#10;&lt;?mso-application progid=&quot;Word.Document&quot;?&gt;&#10;&lt;w:wordDocument xmlns:aml=&quot;http://schemas.microsoft.com/aml/2001/core&quot; xmlns:wpc=&quot;http://schemas.microsoft.com/office/word/2010/wordprocessingCanvas&quot; xmlns:cx=&quot;http://schemas.microsoft.com/office/drawing/2014/chartex&quot; xmlns:cx1=&quot;http://schemas.microsoft.com/office/drawing/2015/9/8/chartex&quot; xmlns:cx2=&quot;http://schemas.microsoft.com/office/drawing/2015/10/21/chartex&quot; xmlns:cx3=&quot;http://schemas.microsoft.com/office/drawing/2016/5/9/chartex&quot; xmlns:cx4=&quot;http://schemas.microsoft.com/office/drawing/2016/5/10/chartex&quot; xmlns:cx5=&quot;http://schemas.microsoft.com/office/drawing/2016/5/11/chartex&quot; xmlns:cx6=&quot;http://schemas.microsoft.com/office/drawing/2016/5/12/chartex&quot; xmlns:cx7=&quot;http://schemas.microsoft.com/office/drawing/2016/5/13/chartex&quot; xmlns:cx8=&quot;http://schemas.microsoft.com/office/drawing/2016/5/14/chartex&quot; xmlns:cr=&quot;http://schemas.microsoft.com/office/comments/2020/reactions&quot; xmlns:dt=&quot;uuid:C2F41010-65B3-11d1-A29F-00AA00C14882&quot; xmlns:mc=&quot;http://schemas.openxmlformats.org/markup-compatibility/2006&quot; xmlns:aink=&quot;http://schemas.microsoft.com/office/drawing/2016/ink&quot; xmlns:am3d=&quot;http://schemas.microsoft.com/office/drawing/2017/model3d&quot; xmlns:o=&quot;urn:schemas-microsoft-com:office:office&quot; xmlns:oel=&quot;http://schemas.microsoft.com/office/2019/extlst&quot; xmlns:m=&quot;http://schemas.openxmlformats.org/officeDocument/2006/math&quot; xmlns:v=&quot;urn:schemas-microsoft-com:vml&quot; xmlns:w10=&quot;urn:schemas-microsoft-com:office:word&quot; xmlns:w=&quot;http://schemas.microsoft.com/office/word/2003/wordml&quot; xmlns:wx=&quot;http://schemas.microsoft.com/office/word/2003/auxHint&quot; xmlns:wne=&quot;http://schemas.microsoft.com/office/word/2006/wordml&quot; xmlns:wsp=&quot;http://schemas.microsoft.com/office/word/2003/wordml/sp2&quot; xmlns:sl=&quot;http://schemas.microsoft.com/schemaLibrary/2003/core&quot; w:macrosPresent=&quot;no&quot; w:embeddedObjPresent=&quot;no&quot; w:ocxPresent=&quot;no&quot; xml:space=&quot;preserve&quot;&gt;&lt;w:ignoreSubtree w:val=&quot;http://schemas.microsoft.com/office/word/2003/wordml/sp2&quot;/&gt;&lt;o:DocumentProperties&gt;&lt;o:Version&gt;16&lt;/o:Version&gt;&lt;/o:DocumentProperties&gt;&lt;w:docPr&gt;&lt;w:view w:val=&quot;print&quot;/&gt;&lt;w:zoom w:percent=&quot;100&quot;/&gt;&lt;w:doNotEmbedSystemFonts/&gt;&lt;w:defaultTabStop w:val=&quot;708&quot;/&gt;&lt;w:hyphenationZone w:val=&quot;425&quot;/&gt;&lt;w:punctuationKerning/&gt;&lt;w:characterSpacingControl w:val=&quot;DontCompress&quot;/&gt;&lt;w:optimizeForBrowser/&gt;&lt;w:allowPNG/&gt;&lt;w:validateAgainstSchema/&gt;&lt;w:saveInvalidXML w:val=&quot;off&quot;/&gt;&lt;w:ignoreMixedContent w:val=&quot;off&quot;/&gt;&lt;w:alwaysShowPlaceholderText w:val=&quot;off&quot;/&gt;&lt;w:compat&gt;&lt;w:breakWrappedTables/&gt;&lt;w:snapToGridInCell/&gt;&lt;w:wrapTextWithPunct/&gt;&lt;w:useAsianBreakRules/&gt;&lt;w:dontGrowAutofit/&gt;&lt;/w:compat&gt;&lt;wsp:rsids&gt;&lt;wsp:rsidRoot wsp:val=&quot;00D73779&quot;/&gt;&lt;wsp:rsid wsp:val=&quot;000C5474&quot;/&gt;&lt;wsp:rsid wsp:val=&quot;00210F88&quot;/&gt;&lt;wsp:rsid wsp:val=&quot;00294C3B&quot;/&gt;&lt;wsp:rsid wsp:val=&quot;003663F2&quot;/&gt;&lt;wsp:rsid wsp:val=&quot;005B3955&quot;/&gt;&lt;wsp:rsid wsp:val=&quot;00D73779&quot;/&gt;&lt;/wsp:rsids&gt;&lt;/w:docPr&gt;&lt;w:body&gt;&lt;wx:sect&gt;&lt;w:p wsp:rsidR=&quot;005B3955&quot; wsp:rsidRDefault=&quot;005B3955&quot; wsp:rsidP=&quot;005B3955&quot;&gt;&lt;m:oMathPara&gt;&lt;m:oMath&gt;&lt;m:r&gt;&lt;w:rPr&gt;&lt;w:rFonts w:ascii=&quot;Cambria Math&quot; w:fareast=&quot;Times New Roman&quot; w:h-ansi=&quot;Cambria Math&quot;/&gt;&lt;wx:font wx:val=&quot;Cambria Math&quot;/&gt;&lt;w:i/&gt;&lt;w:kern w:val=&quot;0&quot;/&gt;&lt;w:lang w:fareast=&quot;ES-PR&quot;/&gt;&lt;/w:rPr&gt;&lt;m:t&gt;Iâˆ&lt;/m:t&gt;&lt;/m:r&gt;&lt;m:sSubSup&gt;&lt;m:sSubSupPr&gt;&lt;m:ctrlPr&gt;&lt;w:rPr&gt;&lt;w:rFonts w:ascii=&quot;Cambria Math&quot; w:fareast=&quot;Times New Roman&quot; w:h-ansi=&quot;Cambria Math&quot;/&gt;&lt;wx:font wx:val=&quot;Cambria Math&quot;/&gt;&lt;w:kern w:val=&quot;0&quot;/&gt;&lt;w:lang w:fareast=&quot;ES-PR&quot;/&gt;&lt;/w:rPr&gt;&lt;/m:ctrlPr&gt;&lt;/m:sSubSupPr&gt;&lt;m:e&gt;&lt;m:r&gt;&lt;w:rPr&gt;&lt;w:rFonts w:ascii=&quot;Cambria Math&quot; w:fareast=&quot;Times New Roman&quot; w:h-ansi=&quot;Cambria Math&quot;/&gt;&lt;wx:font wx:val=&quot;Cambria Math&quot;/&gt;&lt;w:i/&gt;&lt;w:kern w:val=&quot;0&quot;/&gt;&lt;w:lang w:fareast=&quot;ES-PR&quot;/&gt;&lt;/w:rPr&gt;&lt;m:t&gt;P&lt;/m:t&gt;&lt;/m:r&gt;&lt;/m:e&gt;&lt;m:sub&gt;&lt;m:r&gt;&lt;m:rPr&gt;&lt;m:nor/&gt;&lt;/m:rPr&gt;&lt;w:rPr&gt;&lt;w:rFonts w:ascii=&quot;Times New Roman&quot; w:fareast=&quot;Times New Roman&quot; w:h-ansi=&quot;Times New Roman&quot;/&gt;&lt;wx:font wx:val=&quot;Times New Roman&quot;/&gt;&lt;w:kern w:val=&quot;0&quot;/&gt;&lt;w:lang w:fareast=&quot;ES-PR&quot;/&gt;&lt;/w:rPr&gt;&lt;m:t&gt;riesgo&lt;/m:t&gt;&lt;/m:r&gt;&lt;/m:sub&gt;&lt;m:sup&gt;&lt;m:r&gt;&lt;w:rPr&gt;&lt;w:rFonts w:ascii=&quot;Cambria Math&quot; w:fareast=&quot;Times New Roman&quot; w:h-ansi=&quot;Cambria Math&quot;/&gt;&lt;wx:font wx:val=&quot;Cambria Math&quot;/&gt;&lt;w:i/&gt;&lt;w:kern w:val=&quot;0&quot;/&gt;&lt;w:lang w:fareast=&quot;ES-PR&quot;/&gt;&lt;/w:rPr&gt;&lt;m:t&gt;Î±&lt;/m:t&gt;&lt;/m:r&gt;&lt;/m:sup&gt;&lt;/m:sSubSup&gt;&lt;/m:oMath&gt;&lt;/m:oMathPara&gt;&lt;/w:p&gt;&lt;w:sectPr wsp:rsidR=&quot;00000000&quot;&gt;&lt;w:pgSz w:w=&quot;12240&quot; w:h=&quot;15840&quot;/&gt;&lt;w:pgMar w:top=&quot;1440&quot; w:right=&quot;1440&quot; w:bottom=&quot;1440&quot; w:left=&quot;1440&quot; w:header=&quot;720&quot; w:footer=&quot;720&quot; w:gutter=&quot;0&quot;/&gt;&lt;w:cols w:space=&quot;720&quot;/&gt;&lt;/w:sectPr&gt;&lt;/wx:sect&gt;&lt;/w:body&gt;&lt;/w:wordDocument&gt;">
+            <v:imagedata r:id="rId5" o:title="" chromakey="white"/>
+          </v:shape>
+        </w:pict>
+      </w:r>
+      <w:r>
+        <w:instrText xml:space="preserve"> </w:instrText>
+      </w:r>
+      <w:r>
+        <w:fldChar w:fldCharType="separate"/>
+      </w:r>
+      <w:r>
+        <w:pict w14:anchorId="6391F8EC">
+          <v:shape id="_x0000_i1038" type="#_x0000_t75" style="width:47.25pt;height:18pt" equationxml="&lt;?xml version=&quot;1.0&quot; encoding=&quot;UTF-8&quot; standalone=&quot;yes&quot;?&gt;&#10;&lt;?mso-application progid=&quot;Word.Document&quot;?&gt;&#10;&lt;w:wordDocument xmlns:aml=&quot;http://schemas.microsoft.com/aml/2001/core&quot; xmlns:wpc=&quot;http://schemas.microsoft.com/office/word/2010/wordprocessingCanvas&quot; xmlns:cx=&quot;http://schemas.microsoft.com/office/drawing/2014/chartex&quot; xmlns:cx1=&quot;http://schemas.microsoft.com/office/drawing/2015/9/8/chartex&quot; xmlns:cx2=&quot;http://schemas.microsoft.com/office/drawing/2015/10/21/chartex&quot; xmlns:cx3=&quot;http://schemas.microsoft.com/office/drawing/2016/5/9/chartex&quot; xmlns:cx4=&quot;http://schemas.microsoft.com/office/drawing/2016/5/10/chartex&quot; xmlns:cx5=&quot;http://schemas.microsoft.com/office/drawing/2016/5/11/chartex&quot; xmlns:cx6=&quot;http://schemas.microsoft.com/office/drawing/2016/5/12/chartex&quot; xmlns:cx7=&quot;http://schemas.microsoft.com/office/drawing/2016/5/13/chartex&quot; xmlns:cx8=&quot;http://schemas.microsoft.com/office/drawing/2016/5/14/chartex&quot; xmlns:cr=&quot;http://schemas.microsoft.com/office/comments/2020/reactions&quot; xmlns:dt=&quot;uuid:C2F41010-65B3-11d1-A29F-00AA00C14882&quot; xmlns:mc=&quot;http://schemas.openxmlformats.org/markup-compatibility/2006&quot; xmlns:aink=&quot;http://schemas.microsoft.com/office/drawing/2016/ink&quot; xmlns:am3d=&quot;http://schemas.microsoft.com/office/drawing/2017/model3d&quot; xmlns:o=&quot;urn:schemas-microsoft-com:office:office&quot; xmlns:oel=&quot;http://schemas.microsoft.com/office/2019/extlst&quot; xmlns:m=&quot;http://schemas.openxmlformats.org/officeDocument/2006/math&quot; xmlns:v=&quot;urn:schemas-microsoft-com:vml&quot; xmlns:w10=&quot;urn:schemas-microsoft-com:office:word&quot; xmlns:w=&quot;http://schemas.microsoft.com/office/word/2003/wordml&quot; xmlns:wx=&quot;http://schemas.microsoft.com/office/word/2003/auxHint&quot; xmlns:wne=&quot;http://schemas.microsoft.com/office/word/2006/wordml&quot; xmlns:wsp=&quot;http://schemas.microsoft.com/office/word/2003/wordml/sp2&quot; xmlns:sl=&quot;http://schemas.microsoft.com/schemaLibrary/2003/core&quot; w:macrosPresent=&quot;no&quot; w:embeddedObjPresent=&quot;no&quot; w:ocxPresent=&quot;no&quot; xml:space=&quot;preserve&quot;&gt;&lt;w:ignoreSubtree w:val=&quot;http://schemas.microsoft.com/office/word/2003/wordml/sp2&quot;/&gt;&lt;o:DocumentProperties&gt;&lt;o:Version&gt;16&lt;/o:Version&gt;&lt;/o:DocumentProperties&gt;&lt;w:docPr&gt;&lt;w:view w:val=&quot;print&quot;/&gt;&lt;w:zoom w:percent=&quot;100&quot;/&gt;&lt;w:doNotEmbedSystemFonts/&gt;&lt;w:defaultTabStop w:val=&quot;708&quot;/&gt;&lt;w:hyphenationZone w:val=&quot;425&quot;/&gt;&lt;w:punctuationKerning/&gt;&lt;w:characterSpacingControl w:val=&quot;DontCompress&quot;/&gt;&lt;w:optimizeForBrowser/&gt;&lt;w:allowPNG/&gt;&lt;w:validateAgainstSchema/&gt;&lt;w:saveInvalidXML w:val=&quot;off&quot;/&gt;&lt;w:ignoreMixedContent w:val=&quot;off&quot;/&gt;&lt;w:alwaysShowPlaceholderText w:val=&quot;off&quot;/&gt;&lt;w:compat&gt;&lt;w:breakWrappedTables/&gt;&lt;w:snapToGridInCell/&gt;&lt;w:wrapTextWithPunct/&gt;&lt;w:useAsianBreakRules/&gt;&lt;w:dontGrowAutofit/&gt;&lt;/w:compat&gt;&lt;wsp:rsids&gt;&lt;wsp:rsidRoot wsp:val=&quot;00D73779&quot;/&gt;&lt;wsp:rsid wsp:val=&quot;000C5474&quot;/&gt;&lt;wsp:rsid wsp:val=&quot;00210F88&quot;/&gt;&lt;wsp:rsid wsp:val=&quot;00294C3B&quot;/&gt;&lt;wsp:rsid wsp:val=&quot;003663F2&quot;/&gt;&lt;wsp:rsid wsp:val=&quot;005B3955&quot;/&gt;&lt;wsp:rsid wsp:val=&quot;00D73779&quot;/&gt;&lt;/wsp:rsids&gt;&lt;/w:docPr&gt;&lt;w:body&gt;&lt;wx:sect&gt;&lt;w:p wsp:rsidR=&quot;005B3955&quot; wsp:rsidRDefault=&quot;005B3955&quot; wsp:rsidP=&quot;005B3955&quot;&gt;&lt;m:oMathPara&gt;&lt;m:oMath&gt;&lt;m:r&gt;&lt;w:rPr&gt;&lt;w:rFonts w:ascii=&quot;Cambria Math&quot; w:fareast=&quot;Times New Roman&quot; w:h-ansi=&quot;Cambria Math&quot;/&gt;&lt;wx:font wx:val=&quot;Cambria Math&quot;/&gt;&lt;w:i/&gt;&lt;w:kern w:val=&quot;0&quot;/&gt;&lt;w:lang w:fareast=&quot;ES-PR&quot;/&gt;&lt;/w:rPr&gt;&lt;m:t&gt;Iâˆ&lt;/m:t&gt;&lt;/m:r&gt;&lt;m:sSubSup&gt;&lt;m:sSubSupPr&gt;&lt;m:ctrlPr&gt;&lt;w:rPr&gt;&lt;w:rFonts w:ascii=&quot;Cambria Math&quot; w:fareast=&quot;Times New Roman&quot; w:h-ansi=&quot;Cambria Math&quot;/&gt;&lt;wx:font wx:val=&quot;Cambria Math&quot;/&gt;&lt;w:kern w:val=&quot;0&quot;/&gt;&lt;w:lang w:fareast=&quot;ES-PR&quot;/&gt;&lt;/w:rPr&gt;&lt;/m:ctrlPr&gt;&lt;/m:sSubSupPr&gt;&lt;m:e&gt;&lt;m:r&gt;&lt;w:rPr&gt;&lt;w:rFonts w:ascii=&quot;Cambria Math&quot; w:fareast=&quot;Times New Roman&quot; w:h-ansi=&quot;Cambria Math&quot;/&gt;&lt;wx:font wx:val=&quot;Cambria Math&quot;/&gt;&lt;w:i/&gt;&lt;w:kern w:val=&quot;0&quot;/&gt;&lt;w:lang w:fareast=&quot;ES-PR&quot;/&gt;&lt;/w:rPr&gt;&lt;m:t&gt;P&lt;/m:t&gt;&lt;/m:r&gt;&lt;/m:e&gt;&lt;m:sub&gt;&lt;m:r&gt;&lt;m:rPr&gt;&lt;m:nor/&gt;&lt;/m:rPr&gt;&lt;w:rPr&gt;&lt;w:rFonts w:ascii=&quot;Times New Roman&quot; w:fareast=&quot;Times New Roman&quot; w:h-ansi=&quot;Times New Roman&quot;/&gt;&lt;wx:font wx:val=&quot;Times New Roman&quot;/&gt;&lt;w:kern w:val=&quot;0&quot;/&gt;&lt;w:lang w:fareast=&quot;ES-PR&quot;/&gt;&lt;/w:rPr&gt;&lt;m:t&gt;riesgo&lt;/m:t&gt;&lt;/m:r&gt;&lt;/m:sub&gt;&lt;m:sup&gt;&lt;m:r&gt;&lt;w:rPr&gt;&lt;w:rFonts w:ascii=&quot;Cambria Math&quot; w:fareast=&quot;Times New Roman&quot; w:h-ansi=&quot;Cambria Math&quot;/&gt;&lt;wx:font wx:val=&quot;Cambria Math&quot;/&gt;&lt;w:i/&gt;&lt;w:kern w:val=&quot;0&quot;/&gt;&lt;w:lang w:fareast=&quot;ES-PR&quot;/&gt;&lt;/w:rPr&gt;&lt;m:t&gt;Î±&lt;/m:t&gt;&lt;/m:r&gt;&lt;/m:sup&gt;&lt;/m:sSubSup&gt;&lt;/m:oMath&gt;&lt;/m:oMathPara&gt;&lt;/w:p&gt;&lt;w:sectPr wsp:rsidR=&quot;00000000&quot;&gt;&lt;w:pgSz w:w=&quot;12240&quot; w:h=&quot;15840&quot;/&gt;&lt;w:pgMar w:top=&quot;1440&quot; w:right=&quot;1440&quot; w:bottom=&quot;1440&quot; w:left=&quot;1440&quot; w:header=&quot;720&quot; w:footer=&quot;720&quot; w:gutter=&quot;0&quot;/&gt;&lt;w:cols w:space=&quot;720&quot;/&gt;&lt;/w:sectPr&gt;&lt;/wx:sect&gt;&lt;/w:body&gt;&lt;/w:wordDocument&gt;">
+            <v:imagedata r:id="rId5" o:title="" chromakey="white"/>
+          </v:shape>
+        </w:pict>
+      </w:r>
+      <w:r>
+        <w:fldChar w:fldCharType="end"/>
+      </w:r>
+      <w:r>
+        <w:t>I \</w:t>
+      </w:r>
+      <w:proofErr w:type="spellStart"/>
+      <w:r>
+        <w:t>propto</w:t>
+      </w:r>
+      <w:proofErr w:type="spellEnd"/>
+      <w:r>
+        <w:t xml:space="preserve"> P_{\</w:t>
+      </w:r>
+      <w:proofErr w:type="spellStart"/>
+      <w:r>
+        <w:t>text</w:t>
+      </w:r>
+      <w:proofErr w:type="spellEnd"/>
+      <w:r>
+        <w:t>{riesgo</w:t>
+      </w:r>
+      <w:proofErr w:type="gramStart"/>
+      <w:r>
+        <w:t>}}^</w:t>
+      </w:r>
+      <w:proofErr w:type="gramEnd"/>
+      <w:r>
+        <w:t>\</w:t>
+      </w:r>
+      <w:proofErr w:type="spellStart"/>
+      <w:r>
+        <w:t>alpha</w:t>
+      </w:r>
+      <w:proofErr w:type="spellEnd"/>
+    </w:p>
+    <w:p>
+      <w:r>
+        <w:t xml:space="preserve">, DOI: r=0.847, n=6; limitación: n insuficiente para robustez bio). La implicación es que un entorno con mayor riesgo debería fomentar un mayor desarrollo de inteligencia prudencial. </w:t>
+      </w:r>
+    </w:p>
+    <w:p>
+      <w:pPr>
+        <w:numPr>
+          <w:ilvl w:val="0"/>
+          <w:numId w:val="6"/>
+        </w:numPr>
+      </w:pPr>
+      <w:r>
+        <w:t>El Dato Observado (P3): Los resultados preliminares del "barrido de riesgo" (</w:t>
+      </w:r>
+      <w:proofErr w:type="spellStart"/>
+      <w:r>
+        <w:t>sweep_</w:t>
+      </w:r>
+      <w:proofErr w:type="gramStart"/>
+      <w:r>
+        <w:t>risk.json</w:t>
+      </w:r>
+      <w:proofErr w:type="spellEnd"/>
+      <w:proofErr w:type="gramEnd"/>
+      <w:r>
+        <w:t xml:space="preserve">) muestran lo contrario. A medida que el </w:t>
+      </w:r>
+      <w:proofErr w:type="spellStart"/>
+      <w:r>
+        <w:t>risk_scale</w:t>
+      </w:r>
+      <w:proofErr w:type="spellEnd"/>
+      <w:r>
+        <w:t xml:space="preserve"> (el riesgo ambiental) aumenta, la </w:t>
+      </w:r>
+      <w:proofErr w:type="spellStart"/>
+      <w:r>
+        <w:t>avg_reward</w:t>
+      </w:r>
+      <w:proofErr w:type="spellEnd"/>
+      <w:r>
+        <w:t xml:space="preserve"> (recompensa neta) del agente Simbiosis disminuye (de +588.19 a +556.91; consistente con run_1000ep_seed42.json, pero sin </w:t>
+      </w:r>
+      <w:proofErr w:type="spellStart"/>
+      <w:r>
+        <w:t>ICs</w:t>
+      </w:r>
+      <w:proofErr w:type="spellEnd"/>
+      <w:r>
+        <w:t>: varianza no reportada).</w:t>
+      </w:r>
+    </w:p>
+    <w:p>
+      <w:r>
+        <w:lastRenderedPageBreak/>
+        <w:t>Pregunta Central de Investigación:</w:t>
+      </w:r>
+      <w:r>
+        <w:br/>
+        <w:t xml:space="preserve">¿Por qué la recompensa neta del agente (nuestro proxy de éxito) disminuye cuando el riesgo ambiental aumenta, si nuestra teoría H1 predice que el riesgo fomenta la inteligencia? ¿Es este dato una refutación de la H1? Extensión bio: </w:t>
+      </w:r>
+      <w:proofErr w:type="gramStart"/>
+      <w:r>
+        <w:t xml:space="preserve">¿Se replica en AL </w:t>
+      </w:r>
+      <w:proofErr w:type="spellStart"/>
+      <w:r>
+        <w:t>index</w:t>
+      </w:r>
+      <w:proofErr w:type="spellEnd"/>
+      <w:r>
+        <w:t xml:space="preserve"> (</w:t>
+      </w:r>
+      <w:proofErr w:type="spellStart"/>
+      <w:r>
+        <w:t>e.g</w:t>
+      </w:r>
+      <w:proofErr w:type="spellEnd"/>
+      <w:r>
+        <w:t>., ALSPAC: r&lt;0.</w:t>
+      </w:r>
+      <w:proofErr w:type="gramEnd"/>
+      <w:r>
+        <w:t>3 para estrés vs. cognición)?2. El Hallazgo (Hipótesis de Trabajo)</w:t>
+      </w:r>
+      <w:r>
+        <w:br/>
+        <w:t>Nuestra hipótesis de trabajo es que estos datos no refutan la H1. Por el contrario, la refuerzan al revelar una tensión dinámica que demuestra la naturaleza prudencial del agente PGF.</w:t>
+      </w:r>
+      <w:r>
+        <w:br/>
+        <w:t xml:space="preserve">El error está en equiparar la </w:t>
+      </w:r>
+      <w:proofErr w:type="spellStart"/>
+      <w:r>
+        <w:t>avg_reward</w:t>
+      </w:r>
+      <w:proofErr w:type="spellEnd"/>
+      <w:r>
+        <w:t xml:space="preserve"> neta (un puntaje final) con la "inteligencia" (la calidad del proceso de decisión).</w:t>
+      </w:r>
+      <w:r>
+        <w:br/>
+        <w:t xml:space="preserve">Proponemos que la </w:t>
+      </w:r>
+      <w:proofErr w:type="spellStart"/>
+      <w:r>
+        <w:t>avg_reward</w:t>
+      </w:r>
+      <w:proofErr w:type="spellEnd"/>
+      <w:r>
+        <w:t xml:space="preserve"> (el PGF Neto) debe desacoplarse en dos componentes, tal como se define en la lógica de evaluator_pgf.py (antes en dqn_agent.py):</w:t>
+      </w:r>
+      <w:r>
+        <w:br/>
+      </w:r>
+      <w:proofErr w:type="spellStart"/>
+      <w:r>
+        <w:t>PGF_Neto</w:t>
+      </w:r>
+      <w:proofErr w:type="spellEnd"/>
+      <w:r>
+        <w:t xml:space="preserve"> = </w:t>
+      </w:r>
+      <w:proofErr w:type="spellStart"/>
+      <w:r>
+        <w:t>PGF_Beneficio_Bruto</w:t>
+      </w:r>
+      <w:proofErr w:type="spellEnd"/>
+      <w:r>
+        <w:t xml:space="preserve"> - </w:t>
+      </w:r>
+      <w:proofErr w:type="spellStart"/>
+      <w:r>
+        <w:t>PGF_Costo_Ambiental</w:t>
+      </w:r>
+      <w:proofErr w:type="spellEnd"/>
+      <w:r>
+        <w:t xml:space="preserve"> </w:t>
+      </w:r>
+    </w:p>
+    <w:p>
+      <w:pPr>
+        <w:numPr>
+          <w:ilvl w:val="0"/>
+          <w:numId w:val="7"/>
+        </w:numPr>
+      </w:pPr>
+      <w:proofErr w:type="spellStart"/>
+      <w:r>
+        <w:t>PGF_Beneficio_Bruto</w:t>
+      </w:r>
+      <w:proofErr w:type="spellEnd"/>
+      <w:r>
+        <w:t xml:space="preserve">: Es el término </w:t>
+      </w:r>
+    </w:p>
+    <w:p>
+      <w:r>
+        <w:fldChar w:fldCharType="begin"/>
+      </w:r>
+      <w:r>
+        <w:instrText xml:space="preserve"> QUOTE </w:instrText>
+      </w:r>
+      <w:r>
+        <w:pict w14:anchorId="386509D8">
+          <v:shape id="_x0000_i1039" type="#_x0000_t75" style="width:50.25pt;height:16.5pt" equationxml="&lt;?xml version=&quot;1.0&quot; encoding=&quot;UTF-8&quot; standalone=&quot;yes&quot;?&gt;&#10;&lt;?mso-application progid=&quot;Word.Document&quot;?&gt;&#10;&lt;w:wordDocument xmlns:aml=&quot;http://schemas.microsoft.com/aml/2001/core&quot; xmlns:wpc=&quot;http://schemas.microsoft.com/office/word/2010/wordprocessingCanvas&quot; xmlns:cx=&quot;http://schemas.microsoft.com/office/drawing/2014/chartex&quot; xmlns:cx1=&quot;http://schemas.microsoft.com/office/drawing/2015/9/8/chartex&quot; xmlns:cx2=&quot;http://schemas.microsoft.com/office/drawing/2015/10/21/chartex&quot; xmlns:cx3=&quot;http://schemas.microsoft.com/office/drawing/2016/5/9/chartex&quot; xmlns:cx4=&quot;http://schemas.microsoft.com/office/drawing/2016/5/10/chartex&quot; xmlns:cx5=&quot;http://schemas.microsoft.com/office/drawing/2016/5/11/chartex&quot; xmlns:cx6=&quot;http://schemas.microsoft.com/office/drawing/2016/5/12/chartex&quot; xmlns:cx7=&quot;http://schemas.microsoft.com/office/drawing/2016/5/13/chartex&quot; xmlns:cx8=&quot;http://schemas.microsoft.com/office/drawing/2016/5/14/chartex&quot; xmlns:cr=&quot;http://schemas.microsoft.com/office/comments/2020/reactions&quot; xmlns:dt=&quot;uuid:C2F41010-65B3-11d1-A29F-00AA00C14882&quot; xmlns:mc=&quot;http://schemas.openxmlformats.org/markup-compatibility/2006&quot; xmlns:aink=&quot;http://schemas.microsoft.com/office/drawing/2016/ink&quot; xmlns:am3d=&quot;http://schemas.microsoft.com/office/drawing/2017/model3d&quot; xmlns:o=&quot;urn:schemas-microsoft-com:office:office&quot; xmlns:oel=&quot;http://schemas.microsoft.com/office/2019/extlst&quot; xmlns:m=&quot;http://schemas.openxmlformats.org/officeDocument/2006/math&quot; xmlns:v=&quot;urn:schemas-microsoft-com:vml&quot; xmlns:w10=&quot;urn:schemas-microsoft-com:office:word&quot; xmlns:w=&quot;http://schemas.microsoft.com/office/word/2003/wordml&quot; xmlns:wx=&quot;http://schemas.microsoft.com/office/word/2003/auxHint&quot; xmlns:wne=&quot;http://schemas.microsoft.com/office/word/2006/wordml&quot; xmlns:wsp=&quot;http://schemas.microsoft.com/office/word/2003/wordml/sp2&quot; xmlns:sl=&quot;http://schemas.microsoft.com/schemaLibrary/2003/core&quot; w:macrosPresent=&quot;no&quot; w:embeddedObjPresent=&quot;no&quot; w:ocxPresent=&quot;no&quot; xml:space=&quot;preserve&quot;&gt;&lt;w:ignoreSubtree w:val=&quot;http://schemas.microsoft.com/office/word/2003/wordml/sp2&quot;/&gt;&lt;o:DocumentProperties&gt;&lt;o:Version&gt;16&lt;/o:Version&gt;&lt;/o:DocumentProperties&gt;&lt;w:docPr&gt;&lt;w:view w:val=&quot;print&quot;/&gt;&lt;w:zoom w:percent=&quot;100&quot;/&gt;&lt;w:doNotEmbedSystemFonts/&gt;&lt;w:defaultTabStop w:val=&quot;708&quot;/&gt;&lt;w:hyphenationZone w:val=&quot;425&quot;/&gt;&lt;w:punctuationKerning/&gt;&lt;w:characterSpacingControl w:val=&quot;DontCompress&quot;/&gt;&lt;w:optimizeForBrowser/&gt;&lt;w:allowPNG/&gt;&lt;w:validateAgainstSchema/&gt;&lt;w:saveInvalidXML w:val=&quot;off&quot;/&gt;&lt;w:ignoreMixedContent w:val=&quot;off&quot;/&gt;&lt;w:alwaysShowPlaceholderText w:val=&quot;off&quot;/&gt;&lt;w:compat&gt;&lt;w:breakWrappedTables/&gt;&lt;w:snapToGridInCell/&gt;&lt;w:wrapTextWithPunct/&gt;&lt;w:useAsianBreakRules/&gt;&lt;w:dontGrowAutofit/&gt;&lt;/w:compat&gt;&lt;wsp:rsids&gt;&lt;wsp:rsidRoot wsp:val=&quot;00D73779&quot;/&gt;&lt;wsp:rsid wsp:val=&quot;000C5474&quot;/&gt;&lt;wsp:rsid wsp:val=&quot;00210F88&quot;/&gt;&lt;wsp:rsid wsp:val=&quot;00294C3B&quot;/&gt;&lt;wsp:rsid wsp:val=&quot;003663F2&quot;/&gt;&lt;wsp:rsid wsp:val=&quot;003A0A38&quot;/&gt;&lt;wsp:rsid wsp:val=&quot;00D73779&quot;/&gt;&lt;/wsp:rsids&gt;&lt;/w:docPr&gt;&lt;w:body&gt;&lt;wx:sect&gt;&lt;w:p wsp:rsidR=&quot;003A0A38&quot; wsp:rsidRDefault=&quot;003A0A38&quot; wsp:rsidP=&quot;003A0A38&quot;&gt;&lt;m:oMathPara&gt;&lt;m:oMath&gt;&lt;m:r&gt;&lt;w:rPr&gt;&lt;w:rFonts w:ascii=&quot;Cambria Math&quot; w:fareast=&quot;Times New Roman&quot; w:h-ansi=&quot;Cambria Math&quot;/&gt;&lt;wx:font wx:val=&quot;Cambria Math&quot;/&gt;&lt;w:i/&gt;&lt;w:kern w:val=&quot;0&quot;/&gt;&lt;w:lang w:fareast=&quot;ES-PR&quot;/&gt;&lt;/w:rPr&gt;&lt;m:t&gt;Îºâ‹…Î´Pâ‹…&lt;/m:t&gt;&lt;/m:r&gt;&lt;m:sSub&gt;&lt;m:sSubPr&gt;&lt;m:ctrlPr&gt;&lt;w:rPr&gt;&lt;w:rFonts w:ascii=&quot;Cambria Math&quot; w:fareast=&quot;Times New Roman&quot; w:h-ansi=&quot;Cambria Math&quot;/&gt;&lt;wx:font wx:val=&quot;Cambria Math&quot;/&gt;&lt;w:kern w:val=&quot;0&quot;/&gt;&lt;w:lang w:fareast=&quot;ES-PR&quot;/&gt;&lt;/w:rPr&gt;&lt;/m:ctrlPr&gt;&lt;/m:sSubPr&gt;&lt;m:e&gt;&lt;m:r&gt;&lt;w:rPr&gt;&lt;w:rFonts w:ascii=&quot;Cambria Math&quot; w:fareast=&quot;Times New Roman&quot; w:h-ansi=&quot;Cambria Math&quot;/&gt;&lt;wx:font wx:val=&quot;Cambria Math&quot;/&gt;&lt;w:i/&gt;&lt;w:kern w:val=&quot;0&quot;/&gt;&lt;w:lang w:fareast=&quot;ES-PR&quot;/&gt;&lt;/w:rPr&gt;&lt;m:t&gt;A&lt;/m:t&gt;&lt;/m:r&gt;&lt;/m:e&gt;&lt;m:sub&gt;&lt;m:r&gt;&lt;w:rPr&gt;&lt;w:rFonts w:ascii=&quot;Cambria Math&quot; w:fareast=&quot;Times New Roman&quot; w:h-ansi=&quot;Cambria Math&quot;/&gt;&lt;wx:font wx:val=&quot;Cambria Math&quot;/&gt;&lt;w:i/&gt;&lt;w:kern w:val=&quot;0&quot;/&gt;&lt;w:lang w:fareast=&quot;ES-PR&quot;/&gt;&lt;/w:rPr&gt;&lt;m:t&gt;t&lt;/m:t&gt;&lt;/m:r&gt;&lt;/m:sub&gt;&lt;/m:sSub&gt;&lt;/m:oMath&gt;&lt;/m:oMathPara&gt;&lt;/w:p&gt;&lt;w:sectPr wsp:rsidR=&quot;00000000&quot;&gt;&lt;w:pgSz w:w=&quot;12240&quot; w:h=&quot;15840&quot;/&gt;&lt;w:pgMar w:top=&quot;1440&quot; w:right=&quot;1440&quot; w:bottom=&quot;1440&quot; w:left=&quot;1440&quot; w:header=&quot;720&quot; w:footer=&quot;720&quot; w:gutter=&quot;0&quot;/&gt;&lt;w:cols w:space=&quot;720&quot;/&gt;&lt;/w:sectPr&gt;&lt;/wx:sect&gt;&lt;/w:body&gt;&lt;/w:wordDocument&gt;">
+            <v:imagedata r:id="rId6" o:title="" chromakey="white"/>
+          </v:shape>
+        </w:pict>
+      </w:r>
+      <w:r>
+        <w:instrText xml:space="preserve"> </w:instrText>
+      </w:r>
+      <w:r>
+        <w:fldChar w:fldCharType="separate"/>
+      </w:r>
+      <w:r>
+        <w:pict w14:anchorId="79FC28D9">
+          <v:shape id="_x0000_i1040" type="#_x0000_t75" style="width:50.25pt;height:16.5pt" equationxml="&lt;?xml version=&quot;1.0&quot; encoding=&quot;UTF-8&quot; standalone=&quot;yes&quot;?&gt;&#10;&lt;?mso-application progid=&quot;Word.Document&quot;?&gt;&#10;&lt;w:wordDocument xmlns:aml=&quot;http://schemas.microsoft.com/aml/2001/core&quot; xmlns:wpc=&quot;http://schemas.microsoft.com/office/word/2010/wordprocessingCanvas&quot; xmlns:cx=&quot;http://schemas.microsoft.com/office/drawing/2014/chartex&quot; xmlns:cx1=&quot;http://schemas.microsoft.com/office/drawing/2015/9/8/chartex&quot; xmlns:cx2=&quot;http://schemas.microsoft.com/office/drawing/2015/10/21/chartex&quot; xmlns:cx3=&quot;http://schemas.microsoft.com/office/drawing/2016/5/9/chartex&quot; xmlns:cx4=&quot;http://schemas.microsoft.com/office/drawing/2016/5/10/chartex&quot; xmlns:cx5=&quot;http://schemas.microsoft.com/office/drawing/2016/5/11/chartex&quot; xmlns:cx6=&quot;http://schemas.microsoft.com/office/drawing/2016/5/12/chartex&quot; xmlns:cx7=&quot;http://schemas.microsoft.com/office/drawing/2016/5/13/chartex&quot; xmlns:cx8=&quot;http://schemas.microsoft.com/office/drawing/2016/5/14/chartex&quot; xmlns:cr=&quot;http://schemas.microsoft.com/office/comments/2020/reactions&quot; xmlns:dt=&quot;uuid:C2F41010-65B3-11d1-A29F-00AA00C14882&quot; xmlns:mc=&quot;http://schemas.openxmlformats.org/markup-compatibility/2006&quot; xmlns:aink=&quot;http://schemas.microsoft.com/office/drawing/2016/ink&quot; xmlns:am3d=&quot;http://schemas.microsoft.com/office/drawing/2017/model3d&quot; xmlns:o=&quot;urn:schemas-microsoft-com:office:office&quot; xmlns:oel=&quot;http://schemas.microsoft.com/office/2019/extlst&quot; xmlns:m=&quot;http://schemas.openxmlformats.org/officeDocument/2006/math&quot; xmlns:v=&quot;urn:schemas-microsoft-com:vml&quot; xmlns:w10=&quot;urn:schemas-microsoft-com:office:word&quot; xmlns:w=&quot;http://schemas.microsoft.com/office/word/2003/wordml&quot; xmlns:wx=&quot;http://schemas.microsoft.com/office/word/2003/auxHint&quot; xmlns:wne=&quot;http://schemas.microsoft.com/office/word/2006/wordml&quot; xmlns:wsp=&quot;http://schemas.microsoft.com/office/word/2003/wordml/sp2&quot; xmlns:sl=&quot;http://schemas.microsoft.com/schemaLibrary/2003/core&quot; w:macrosPresent=&quot;no&quot; w:embeddedObjPresent=&quot;no&quot; w:ocxPresent=&quot;no&quot; xml:space=&quot;preserve&quot;&gt;&lt;w:ignoreSubtree w:val=&quot;http://schemas.microsoft.com/office/word/2003/wordml/sp2&quot;/&gt;&lt;o:DocumentProperties&gt;&lt;o:Version&gt;16&lt;/o:Version&gt;&lt;/o:DocumentProperties&gt;&lt;w:docPr&gt;&lt;w:view w:val=&quot;print&quot;/&gt;&lt;w:zoom w:percent=&quot;100&quot;/&gt;&lt;w:doNotEmbedSystemFonts/&gt;&lt;w:defaultTabStop w:val=&quot;708&quot;/&gt;&lt;w:hyphenationZone w:val=&quot;425&quot;/&gt;&lt;w:punctuationKerning/&gt;&lt;w:characterSpacingControl w:val=&quot;DontCompress&quot;/&gt;&lt;w:optimizeForBrowser/&gt;&lt;w:allowPNG/&gt;&lt;w:validateAgainstSchema/&gt;&lt;w:saveInvalidXML w:val=&quot;off&quot;/&gt;&lt;w:ignoreMixedContent w:val=&quot;off&quot;/&gt;&lt;w:alwaysShowPlaceholderText w:val=&quot;off&quot;/&gt;&lt;w:compat&gt;&lt;w:breakWrappedTables/&gt;&lt;w:snapToGridInCell/&gt;&lt;w:wrapTextWithPunct/&gt;&lt;w:useAsianBreakRules/&gt;&lt;w:dontGrowAutofit/&gt;&lt;/w:compat&gt;&lt;wsp:rsids&gt;&lt;wsp:rsidRoot wsp:val=&quot;00D73779&quot;/&gt;&lt;wsp:rsid wsp:val=&quot;000C5474&quot;/&gt;&lt;wsp:rsid wsp:val=&quot;00210F88&quot;/&gt;&lt;wsp:rsid wsp:val=&quot;00294C3B&quot;/&gt;&lt;wsp:rsid wsp:val=&quot;003663F2&quot;/&gt;&lt;wsp:rsid wsp:val=&quot;003A0A38&quot;/&gt;&lt;wsp:rsid wsp:val=&quot;00D73779&quot;/&gt;&lt;/wsp:rsids&gt;&lt;/w:docPr&gt;&lt;w:body&gt;&lt;wx:sect&gt;&lt;w:p wsp:rsidR=&quot;003A0A38&quot; wsp:rsidRDefault=&quot;003A0A38&quot; wsp:rsidP=&quot;003A0A38&quot;&gt;&lt;m:oMathPara&gt;&lt;m:oMath&gt;&lt;m:r&gt;&lt;w:rPr&gt;&lt;w:rFonts w:ascii=&quot;Cambria Math&quot; w:fareast=&quot;Times New Roman&quot; w:h-ansi=&quot;Cambria Math&quot;/&gt;&lt;wx:font wx:val=&quot;Cambria Math&quot;/&gt;&lt;w:i/&gt;&lt;w:kern w:val=&quot;0&quot;/&gt;&lt;w:lang w:fareast=&quot;ES-PR&quot;/&gt;&lt;/w:rPr&gt;&lt;m:t&gt;Îºâ‹…Î´Pâ‹…&lt;/m:t&gt;&lt;/m:r&gt;&lt;m:sSub&gt;&lt;m:sSubPr&gt;&lt;m:ctrlPr&gt;&lt;w:rPr&gt;&lt;w:rFonts w:ascii=&quot;Cambria Math&quot; w:fareast=&quot;Times New Roman&quot; w:h-ansi=&quot;Cambria Math&quot;/&gt;&lt;wx:font wx:val=&quot;Cambria Math&quot;/&gt;&lt;w:kern w:val=&quot;0&quot;/&gt;&lt;w:lang w:fareast=&quot;ES-PR&quot;/&gt;&lt;/w:rPr&gt;&lt;/m:ctrlPr&gt;&lt;/m:sSubPr&gt;&lt;m:e&gt;&lt;m:r&gt;&lt;w:rPr&gt;&lt;w:rFonts w:ascii=&quot;Cambria Math&quot; w:fareast=&quot;Times New Roman&quot; w:h-ansi=&quot;Cambria Math&quot;/&gt;&lt;wx:font wx:val=&quot;Cambria Math&quot;/&gt;&lt;w:i/&gt;&lt;w:kern w:val=&quot;0&quot;/&gt;&lt;w:lang w:fareast=&quot;ES-PR&quot;/&gt;&lt;/w:rPr&gt;&lt;m:t&gt;A&lt;/m:t&gt;&lt;/m:r&gt;&lt;/m:e&gt;&lt;m:sub&gt;&lt;m:r&gt;&lt;w:rPr&gt;&lt;w:rFonts w:ascii=&quot;Cambria Math&quot; w:fareast=&quot;Times New Roman&quot; w:h-ansi=&quot;Cambria Math&quot;/&gt;&lt;wx:font wx:val=&quot;Cambria Math&quot;/&gt;&lt;w:i/&gt;&lt;w:kern w:val=&quot;0&quot;/&gt;&lt;w:lang w:fareast=&quot;ES-PR&quot;/&gt;&lt;/w:rPr&gt;&lt;m:t&gt;t&lt;/m:t&gt;&lt;/m:r&gt;&lt;/m:sub&gt;&lt;/m:sSub&gt;&lt;/m:oMath&gt;&lt;/m:oMathPara&gt;&lt;/w:p&gt;&lt;w:sectPr wsp:rsidR=&quot;00000000&quot;&gt;&lt;w:pgSz w:w=&quot;12240&quot; w:h=&quot;15840&quot;/&gt;&lt;w:pgMar w:top=&quot;1440&quot; w:right=&quot;1440&quot; w:bottom=&quot;1440&quot; w:left=&quot;1440&quot; w:header=&quot;720&quot; w:footer=&quot;720&quot; w:gutter=&quot;0&quot;/&gt;&lt;w:cols w:space=&quot;720&quot;/&gt;&lt;/w:sectPr&gt;&lt;/wx:sect&gt;&lt;/w:body&gt;&lt;/w:wordDocument&gt;">
+            <v:imagedata r:id="rId6" o:title="" chromakey="white"/>
+          </v:shape>
+        </w:pict>
+      </w:r>
+      <w:r>
+        <w:fldChar w:fldCharType="end"/>
+      </w:r>
+      <w:r>
+        <w:t>\kappa \</w:t>
+      </w:r>
+      <w:proofErr w:type="spellStart"/>
+      <w:r>
+        <w:t>cdot</w:t>
+      </w:r>
+      <w:proofErr w:type="spellEnd"/>
+      <w:r>
+        <w:t xml:space="preserve"> \delta P \</w:t>
+      </w:r>
+      <w:proofErr w:type="spellStart"/>
+      <w:r>
+        <w:t>cdot</w:t>
+      </w:r>
+      <w:proofErr w:type="spellEnd"/>
+      <w:r>
+        <w:t xml:space="preserve"> </w:t>
+      </w:r>
+      <w:proofErr w:type="spellStart"/>
+      <w:r>
+        <w:t>A_t</w:t>
+      </w:r>
+      <w:proofErr w:type="spellEnd"/>
+    </w:p>
+    <w:p>
+      <w:r>
+        <w:t xml:space="preserve">. Esta es nuestra verdadera métrica de "inteligencia": la habilidad del agente para tomar decisiones que reducen el riesgo futuro y se alinean con el propósito (DOI: alineado con IPG, pero sin validación empírica). </w:t>
+      </w:r>
+    </w:p>
+    <w:p>
+      <w:pPr>
+        <w:numPr>
+          <w:ilvl w:val="0"/>
+          <w:numId w:val="7"/>
+        </w:numPr>
+      </w:pPr>
+      <w:proofErr w:type="spellStart"/>
+      <w:r>
+        <w:t>PGF_Costo_Ambiental</w:t>
+      </w:r>
+      <w:proofErr w:type="spellEnd"/>
+      <w:r>
+        <w:t xml:space="preserve">: Es el término </w:t>
+      </w:r>
+    </w:p>
+    <w:p>
+      <w:r>
+        <w:fldChar w:fldCharType="begin"/>
+      </w:r>
+      <w:r>
+        <w:instrText xml:space="preserve"> QUOTE </w:instrText>
+      </w:r>
+      <w:r>
+        <w:pict w14:anchorId="3DC75E4A">
+          <v:shape id="_x0000_i1041" type="#_x0000_t75" style="width:37.5pt;height:16.5pt" equationxml="&lt;?xml version=&quot;1.0&quot; encoding=&quot;UTF-8&quot; standalone=&quot;yes&quot;?&gt;&#10;&lt;?mso-application progid=&quot;Word.Document&quot;?&gt;&#10;&lt;w:wordDocument xmlns:aml=&quot;http://schemas.microsoft.com/aml/2001/core&quot; xmlns:wpc=&quot;http://schemas.microsoft.com/office/word/2010/wordprocessingCanvas&quot; xmlns:cx=&quot;http://schemas.microsoft.com/office/drawing/2014/chartex&quot; xmlns:cx1=&quot;http://schemas.microsoft.com/office/drawing/2015/9/8/chartex&quot; xmlns:cx2=&quot;http://schemas.microsoft.com/office/drawing/2015/10/21/chartex&quot; xmlns:cx3=&quot;http://schemas.microsoft.com/office/drawing/2016/5/9/chartex&quot; xmlns:cx4=&quot;http://schemas.microsoft.com/office/drawing/2016/5/10/chartex&quot; xmlns:cx5=&quot;http://schemas.microsoft.com/office/drawing/2016/5/11/chartex&quot; xmlns:cx6=&quot;http://schemas.microsoft.com/office/drawing/2016/5/12/chartex&quot; xmlns:cx7=&quot;http://schemas.microsoft.com/office/drawing/2016/5/13/chartex&quot; xmlns:cx8=&quot;http://schemas.microsoft.com/office/drawing/2016/5/14/chartex&quot; xmlns:cr=&quot;http://schemas.microsoft.com/office/comments/2020/reactions&quot; xmlns:dt=&quot;uuid:C2F41010-65B3-11d1-A29F-00AA00C14882&quot; xmlns:mc=&quot;http://schemas.openxmlformats.org/markup-compatibility/2006&quot; xmlns:aink=&quot;http://schemas.microsoft.com/office/drawing/2016/ink&quot; xmlns:am3d=&quot;http://schemas.microsoft.com/office/drawing/2017/model3d&quot; xmlns:o=&quot;urn:schemas-microsoft-com:office:office&quot; xmlns:oel=&quot;http://schemas.microsoft.com/office/2019/extlst&quot; xmlns:m=&quot;http://schemas.openxmlformats.org/officeDocument/2006/math&quot; xmlns:v=&quot;urn:schemas-microsoft-com:vml&quot; xmlns:w10=&quot;urn:schemas-microsoft-com:office:word&quot; xmlns:w=&quot;http://schemas.microsoft.com/office/word/2003/wordml&quot; xmlns:wx=&quot;http://schemas.microsoft.com/office/word/2003/auxHint&quot; xmlns:wne=&quot;http://schemas.microsoft.com/office/word/2006/wordml&quot; xmlns:wsp=&quot;http://schemas.microsoft.com/office/word/2003/wordml/sp2&quot; xmlns:sl=&quot;http://schemas.microsoft.com/schemaLibrary/2003/core&quot; w:macrosPresent=&quot;no&quot; w:embeddedObjPresent=&quot;no&quot; w:ocxPresent=&quot;no&quot; xml:space=&quot;preserve&quot;&gt;&lt;w:ignoreSubtree w:val=&quot;http://schemas.microsoft.com/office/word/2003/wordml/sp2&quot;/&gt;&lt;o:DocumentProperties&gt;&lt;o:Version&gt;16&lt;/o:Version&gt;&lt;/o:DocumentProperties&gt;&lt;w:docPr&gt;&lt;w:view w:val=&quot;print&quot;/&gt;&lt;w:zoom w:percent=&quot;100&quot;/&gt;&lt;w:doNotEmbedSystemFonts/&gt;&lt;w:defaultTabStop w:val=&quot;708&quot;/&gt;&lt;w:hyphenationZone w:val=&quot;425&quot;/&gt;&lt;w:punctuationKerning/&gt;&lt;w:characterSpacingControl w:val=&quot;DontCompress&quot;/&gt;&lt;w:optimizeForBrowser/&gt;&lt;w:allowPNG/&gt;&lt;w:validateAgainstSchema/&gt;&lt;w:saveInvalidXML w:val=&quot;off&quot;/&gt;&lt;w:ignoreMixedContent w:val=&quot;off&quot;/&gt;&lt;w:alwaysShowPlaceholderText w:val=&quot;off&quot;/&gt;&lt;w:compat&gt;&lt;w:breakWrappedTables/&gt;&lt;w:snapToGridInCell/&gt;&lt;w:wrapTextWithPunct/&gt;&lt;w:useAsianBreakRules/&gt;&lt;w:dontGrowAutofit/&gt;&lt;/w:compat&gt;&lt;wsp:rsids&gt;&lt;wsp:rsidRoot wsp:val=&quot;00D73779&quot;/&gt;&lt;wsp:rsid wsp:val=&quot;000C5474&quot;/&gt;&lt;wsp:rsid wsp:val=&quot;00210F88&quot;/&gt;&lt;wsp:rsid wsp:val=&quot;00294C3B&quot;/&gt;&lt;wsp:rsid wsp:val=&quot;003663F2&quot;/&gt;&lt;wsp:rsid wsp:val=&quot;00693289&quot;/&gt;&lt;wsp:rsid wsp:val=&quot;00D73779&quot;/&gt;&lt;/wsp:rsids&gt;&lt;/w:docPr&gt;&lt;w:body&gt;&lt;wx:sect&gt;&lt;w:p wsp:rsidR=&quot;00693289&quot; wsp:rsidRDefault=&quot;00693289&quot; wsp:rsidP=&quot;00693289&quot;&gt;&lt;m:oMathPara&gt;&lt;m:oMath&gt;&lt;m:sSub&gt;&lt;m:sSubPr&gt;&lt;m:ctrlPr&gt;&lt;w:rPr&gt;&lt;w:rFonts w:ascii=&quot;Cambria Math&quot; w:fareast=&quot;Times New Roman&quot; w:h-ansi=&quot;Cambria Math&quot;/&gt;&lt;wx:font wx:val=&quot;Cambria Math&quot;/&gt;&lt;w:kern w:val=&quot;0&quot;/&gt;&lt;w:lang w:fareast=&quot;ES-PR&quot;/&gt;&lt;/w:rPr&gt;&lt;/m:ctrlPr&gt;&lt;/m:sSubPr&gt;&lt;m:e&gt;&lt;m:r&gt;&lt;w:rPr&gt;&lt;w:rFonts w:ascii=&quot;Cambria Math&quot; w:fareast=&quot;Times New Roman&quot; w:h-ansi=&quot;Cambria Math&quot;/&gt;&lt;wx:font wx:val=&quot;Cambria Math&quot;/&gt;&lt;w:i/&gt;&lt;w:kern w:val=&quot;0&quot;/&gt;&lt;w:lang w:fareast=&quot;ES-PR&quot;/&gt;&lt;/w:rPr&gt;&lt;m:t&gt;Î»&lt;/m:t&gt;&lt;/m:r&gt;&lt;/m:e&gt;&lt;m:sub&gt;&lt;m:r&gt;&lt;w:rPr&gt;&lt;w:rFonts w:ascii=&quot;Cambria Math&quot; w:fareast=&quot;Times New Roman&quot; w:h-ansi=&quot;Cambria Math&quot;/&gt;&lt;wx:font wx:val=&quot;Cambria Math&quot;/&gt;&lt;w:i/&gt;&lt;w:kern w:val=&quot;0&quot;/&gt;&lt;w:lang w:fareast=&quot;ES-PR&quot;/&gt;&lt;/w:rPr&gt;&lt;m:t&gt;c&lt;/m:t&gt;&lt;/m:r&gt;&lt;/m:sub&gt;&lt;/m:sSub&gt;&lt;m:r&gt;&lt;w:rPr&gt;&lt;w:rFonts w:ascii=&quot;Cambria Math&quot; w:fareast=&quot;Times New Roman&quot; w:h-ansi=&quot;Cambria Math&quot;/&gt;&lt;wx:font wx:val=&quot;Cambria Math&quot;/&gt;&lt;w:i/&gt;&lt;w:kern w:val=&quot;0&quot;/&gt;&lt;w:lang w:fareast=&quot;ES-PR&quot;/&gt;&lt;/w:rPr&gt;&lt;m:t&gt;â‹…Î´&lt;/m:t&gt;&lt;/m:r&gt;&lt;m:sSub&gt;&lt;m:sSubPr&gt;&lt;m:ctrlPr&gt;&lt;w:rPr&gt;&lt;w:rFonts w:ascii=&quot;Cambria Math&quot; w:fareast=&quot;Times New Roman&quot; w:h-ansi=&quot;Cambria Math&quot;/&gt;&lt;wx:font wx:val=&quot;Cambria Math&quot;/&gt;&lt;w:kern w:val=&quot;0&quot;/&gt;&lt;w:lang w:fareast=&quot;ES-PR&quot;/&gt;&lt;/w:rPr&gt;&lt;/m:ctrlPr&gt;&lt;/m:sSubPr&gt;&lt;m:e&gt;&lt;m:r&gt;&lt;w:rPr&gt;&lt;w:rFonts w:ascii=&quot;Cambria Math&quot; w:fareast=&quot;Times New Roman&quot; w:h-ansi=&quot;Cambria Math&quot;/&gt;&lt;wx:font wx:val=&quot;Cambria Math&quot;/&gt;&lt;w:i/&gt;&lt;w:kern w:val=&quot;0&quot;/&gt;&lt;w:lang w:fareast=&quot;ES-PR&quot;/&gt;&lt;/w:rPr&gt;&lt;m:t&gt;C&lt;/m:t&gt;&lt;/m:r&gt;&lt;/m:e&gt;&lt;m:sub&gt;&lt;m:r&gt;&lt;w:rPr&gt;&lt;w:rFonts w:ascii=&quot;Cambria Math&quot; w:fareast=&quot;Times New Roman&quot; w:h-ansi=&quot;Cambria Math&quot;/&gt;&lt;wx:font wx:val=&quot;Cambria Math&quot;/&gt;&lt;w:i/&gt;&lt;w:kern w:val=&quot;0&quot;/&gt;&lt;w:lang w:fareast=&quot;ES-PR&quot;/&gt;&lt;/w:rPr&gt;&lt;m:t&gt;t&lt;/m:t&gt;&lt;/m:r&gt;&lt;/m:sub&gt;&lt;/m:sSub&gt;&lt;/m:oMath&gt;&lt;/m:oMathPara&gt;&lt;/w:p&gt;&lt;w:sectPr wsp:rsidR=&quot;00000000&quot;&gt;&lt;w:pgSz w:w=&quot;12240&quot; w:h=&quot;15840&quot;/&gt;&lt;w:pgMar w:top=&quot;1440&quot; w:right=&quot;1440&quot; w:bottom=&quot;1440&quot; w:left=&quot;1440&quot; w:header=&quot;720&quot; w:footer=&quot;720&quot; w:gutter=&quot;0&quot;/&gt;&lt;w:cols w:space=&quot;720&quot;/&gt;&lt;/w:sectPr&gt;&lt;/wx:sect&gt;&lt;/w:body&gt;&lt;/w:wordDocument&gt;">
+            <v:imagedata r:id="rId7" o:title="" chromakey="white"/>
+          </v:shape>
+        </w:pict>
+      </w:r>
+      <w:r>
+        <w:instrText xml:space="preserve"> </w:instrText>
+      </w:r>
+      <w:r>
+        <w:fldChar w:fldCharType="separate"/>
+      </w:r>
+      <w:r>
+        <w:pict w14:anchorId="59FCAF58">
+          <v:shape id="_x0000_i1042" type="#_x0000_t75" style="width:37.5pt;height:16.5pt" equationxml="&lt;?xml version=&quot;1.0&quot; encoding=&quot;UTF-8&quot; standalone=&quot;yes&quot;?&gt;&#10;&lt;?mso-application progid=&quot;Word.Document&quot;?&gt;&#10;&lt;w:wordDocument xmlns:aml=&quot;http://schemas.microsoft.com/aml/2001/core&quot; xmlns:wpc=&quot;http://schemas.microsoft.com/office/word/2010/wordprocessingCanvas&quot; xmlns:cx=&quot;http://schemas.microsoft.com/office/drawing/2014/chartex&quot; xmlns:cx1=&quot;http://schemas.microsoft.com/office/drawing/2015/9/8/chartex&quot; xmlns:cx2=&quot;http://schemas.microsoft.com/office/drawing/2015/10/21/chartex&quot; xmlns:cx3=&quot;http://schemas.microsoft.com/office/drawing/2016/5/9/chartex&quot; xmlns:cx4=&quot;http://schemas.microsoft.com/office/drawing/2016/5/10/chartex&quot; xmlns:cx5=&quot;http://schemas.microsoft.com/office/drawing/2016/5/11/chartex&quot; xmlns:cx6=&quot;http://schemas.microsoft.com/office/drawing/2016/5/12/chartex&quot; xmlns:cx7=&quot;http://schemas.microsoft.com/office/drawing/2016/5/13/chartex&quot; xmlns:cx8=&quot;http://schemas.microsoft.com/office/drawing/2016/5/14/chartex&quot; xmlns:cr=&quot;http://schemas.microsoft.com/office/comments/2020/reactions&quot; xmlns:dt=&quot;uuid:C2F41010-65B3-11d1-A29F-00AA00C14882&quot; xmlns:mc=&quot;http://schemas.openxmlformats.org/markup-compatibility/2006&quot; xmlns:aink=&quot;http://schemas.microsoft.com/office/drawing/2016/ink&quot; xmlns:am3d=&quot;http://schemas.microsoft.com/office/drawing/2017/model3d&quot; xmlns:o=&quot;urn:schemas-microsoft-com:office:office&quot; xmlns:oel=&quot;http://schemas.microsoft.com/office/2019/extlst&quot; xmlns:m=&quot;http://schemas.openxmlformats.org/officeDocument/2006/math&quot; xmlns:v=&quot;urn:schemas-microsoft-com:vml&quot; xmlns:w10=&quot;urn:schemas-microsoft-com:office:word&quot; xmlns:w=&quot;http://schemas.microsoft.com/office/word/2003/wordml&quot; xmlns:wx=&quot;http://schemas.microsoft.com/office/word/2003/auxHint&quot; xmlns:wne=&quot;http://schemas.microsoft.com/office/word/2006/wordml&quot; xmlns:wsp=&quot;http://schemas.microsoft.com/office/word/2003/wordml/sp2&quot; xmlns:sl=&quot;http://schemas.microsoft.com/schemaLibrary/2003/core&quot; w:macrosPresent=&quot;no&quot; w:embeddedObjPresent=&quot;no&quot; w:ocxPresent=&quot;no&quot; xml:space=&quot;preserve&quot;&gt;&lt;w:ignoreSubtree w:val=&quot;http://schemas.microsoft.com/office/word/2003/wordml/sp2&quot;/&gt;&lt;o:DocumentProperties&gt;&lt;o:Version&gt;16&lt;/o:Version&gt;&lt;/o:DocumentProperties&gt;&lt;w:docPr&gt;&lt;w:view w:val=&quot;print&quot;/&gt;&lt;w:zoom w:percent=&quot;100&quot;/&gt;&lt;w:doNotEmbedSystemFonts/&gt;&lt;w:defaultTabStop w:val=&quot;708&quot;/&gt;&lt;w:hyphenationZone w:val=&quot;425&quot;/&gt;&lt;w:punctuationKerning/&gt;&lt;w:characterSpacingControl w:val=&quot;DontCompress&quot;/&gt;&lt;w:optimizeForBrowser/&gt;&lt;w:allowPNG/&gt;&lt;w:validateAgainstSchema/&gt;&lt;w:saveInvalidXML w:val=&quot;off&quot;/&gt;&lt;w:ignoreMixedContent w:val=&quot;off&quot;/&gt;&lt;w:alwaysShowPlaceholderText w:val=&quot;off&quot;/&gt;&lt;w:compat&gt;&lt;w:breakWrappedTables/&gt;&lt;w:snapToGridInCell/&gt;&lt;w:wrapTextWithPunct/&gt;&lt;w:useAsianBreakRules/&gt;&lt;w:dontGrowAutofit/&gt;&lt;/w:compat&gt;&lt;wsp:rsids&gt;&lt;wsp:rsidRoot wsp:val=&quot;00D73779&quot;/&gt;&lt;wsp:rsid wsp:val=&quot;000C5474&quot;/&gt;&lt;wsp:rsid wsp:val=&quot;00210F88&quot;/&gt;&lt;wsp:rsid wsp:val=&quot;00294C3B&quot;/&gt;&lt;wsp:rsid wsp:val=&quot;003663F2&quot;/&gt;&lt;wsp:rsid wsp:val=&quot;00693289&quot;/&gt;&lt;wsp:rsid wsp:val=&quot;00D73779&quot;/&gt;&lt;/wsp:rsids&gt;&lt;/w:docPr&gt;&lt;w:body&gt;&lt;wx:sect&gt;&lt;w:p wsp:rsidR=&quot;00693289&quot; wsp:rsidRDefault=&quot;00693289&quot; wsp:rsidP=&quot;00693289&quot;&gt;&lt;m:oMathPara&gt;&lt;m:oMath&gt;&lt;m:sSub&gt;&lt;m:sSubPr&gt;&lt;m:ctrlPr&gt;&lt;w:rPr&gt;&lt;w:rFonts w:ascii=&quot;Cambria Math&quot; w:fareast=&quot;Times New Roman&quot; w:h-ansi=&quot;Cambria Math&quot;/&gt;&lt;wx:font wx:val=&quot;Cambria Math&quot;/&gt;&lt;w:kern w:val=&quot;0&quot;/&gt;&lt;w:lang w:fareast=&quot;ES-PR&quot;/&gt;&lt;/w:rPr&gt;&lt;/m:ctrlPr&gt;&lt;/m:sSubPr&gt;&lt;m:e&gt;&lt;m:r&gt;&lt;w:rPr&gt;&lt;w:rFonts w:ascii=&quot;Cambria Math&quot; w:fareast=&quot;Times New Roman&quot; w:h-ansi=&quot;Cambria Math&quot;/&gt;&lt;wx:font wx:val=&quot;Cambria Math&quot;/&gt;&lt;w:i/&gt;&lt;w:kern w:val=&quot;0&quot;/&gt;&lt;w:lang w:fareast=&quot;ES-PR&quot;/&gt;&lt;/w:rPr&gt;&lt;m:t&gt;Î»&lt;/m:t&gt;&lt;/m:r&gt;&lt;/m:e&gt;&lt;m:sub&gt;&lt;m:r&gt;&lt;w:rPr&gt;&lt;w:rFonts w:ascii=&quot;Cambria Math&quot; w:fareast=&quot;Times New Roman&quot; w:h-ansi=&quot;Cambria Math&quot;/&gt;&lt;wx:font wx:val=&quot;Cambria Math&quot;/&gt;&lt;w:i/&gt;&lt;w:kern w:val=&quot;0&quot;/&gt;&lt;w:lang w:fareast=&quot;ES-PR&quot;/&gt;&lt;/w:rPr&gt;&lt;m:t&gt;c&lt;/m:t&gt;&lt;/m:r&gt;&lt;/m:sub&gt;&lt;/m:sSub&gt;&lt;m:r&gt;&lt;w:rPr&gt;&lt;w:rFonts w:ascii=&quot;Cambria Math&quot; w:fareast=&quot;Times New Roman&quot; w:h-ansi=&quot;Cambria Math&quot;/&gt;&lt;wx:font wx:val=&quot;Cambria Math&quot;/&gt;&lt;w:i/&gt;&lt;w:kern w:val=&quot;0&quot;/&gt;&lt;w:lang w:fareast=&quot;ES-PR&quot;/&gt;&lt;/w:rPr&gt;&lt;m:t&gt;â‹…Î´&lt;/m:t&gt;&lt;/m:r&gt;&lt;m:sSub&gt;&lt;m:sSubPr&gt;&lt;m:ctrlPr&gt;&lt;w:rPr&gt;&lt;w:rFonts w:ascii=&quot;Cambria Math&quot; w:fareast=&quot;Times New Roman&quot; w:h-ansi=&quot;Cambria Math&quot;/&gt;&lt;wx:font wx:val=&quot;Cambria Math&quot;/&gt;&lt;w:kern w:val=&quot;0&quot;/&gt;&lt;w:lang w:fareast=&quot;ES-PR&quot;/&gt;&lt;/w:rPr&gt;&lt;/m:ctrlPr&gt;&lt;/m:sSubPr&gt;&lt;m:e&gt;&lt;m:r&gt;&lt;w:rPr&gt;&lt;w:rFonts w:ascii=&quot;Cambria Math&quot; w:fareast=&quot;Times New Roman&quot; w:h-ansi=&quot;Cambria Math&quot;/&gt;&lt;wx:font wx:val=&quot;Cambria Math&quot;/&gt;&lt;w:i/&gt;&lt;w:kern w:val=&quot;0&quot;/&gt;&lt;w:lang w:fareast=&quot;ES-PR&quot;/&gt;&lt;/w:rPr&gt;&lt;m:t&gt;C&lt;/m:t&gt;&lt;/m:r&gt;&lt;/m:e&gt;&lt;m:sub&gt;&lt;m:r&gt;&lt;w:rPr&gt;&lt;w:rFonts w:ascii=&quot;Cambria Math&quot; w:fareast=&quot;Times New Roman&quot; w:h-ansi=&quot;Cambria Math&quot;/&gt;&lt;wx:font wx:val=&quot;Cambria Math&quot;/&gt;&lt;w:i/&gt;&lt;w:kern w:val=&quot;0&quot;/&gt;&lt;w:lang w:fareast=&quot;ES-PR&quot;/&gt;&lt;/w:rPr&gt;&lt;m:t&gt;t&lt;/m:t&gt;&lt;/m:r&gt;&lt;/m:sub&gt;&lt;/m:sSub&gt;&lt;/m:oMath&gt;&lt;/m:oMathPara&gt;&lt;/w:p&gt;&lt;w:sectPr wsp:rsidR=&quot;00000000&quot;&gt;&lt;w:pgSz w:w=&quot;12240&quot; w:h=&quot;15840&quot;/&gt;&lt;w:pgMar w:top=&quot;1440&quot; w:right=&quot;1440&quot; w:bottom=&quot;1440&quot; w:left=&quot;1440&quot; w:header=&quot;720&quot; w:footer=&quot;720&quot; w:gutter=&quot;0&quot;/&gt;&lt;w:cols w:space=&quot;720&quot;/&gt;&lt;/w:sectPr&gt;&lt;/wx:sect&gt;&lt;/w:body&gt;&lt;/w:wordDocument&gt;">
+            <v:imagedata r:id="rId7" o:title="" chromakey="white"/>
+          </v:shape>
+        </w:pict>
+      </w:r>
+      <w:r>
+        <w:fldChar w:fldCharType="end"/>
+      </w:r>
+      <w:r>
+        <w:t>\</w:t>
+      </w:r>
+      <w:proofErr w:type="spellStart"/>
+      <w:r>
+        <w:t>lambda_c</w:t>
+      </w:r>
+      <w:proofErr w:type="spellEnd"/>
+      <w:r>
+        <w:t xml:space="preserve"> \</w:t>
+      </w:r>
+      <w:proofErr w:type="spellStart"/>
+      <w:r>
+        <w:t>cdot</w:t>
+      </w:r>
+      <w:proofErr w:type="spellEnd"/>
+      <w:r>
+        <w:t xml:space="preserve"> \delta </w:t>
+      </w:r>
+      <w:proofErr w:type="spellStart"/>
+      <w:r>
+        <w:t>C_t</w:t>
+      </w:r>
+      <w:proofErr w:type="spellEnd"/>
+    </w:p>
+    <w:p>
+      <w:r>
+        <w:t xml:space="preserve">. Este término mide las penalizaciones de recursos sufridas en el entorno (ej. pisar </w:t>
+      </w:r>
+      <w:proofErr w:type="spellStart"/>
+      <w:r>
+        <w:t>tripwires</w:t>
+      </w:r>
+      <w:proofErr w:type="spellEnd"/>
+      <w:r>
+        <w:t>).</w:t>
+      </w:r>
+    </w:p>
+    <w:p>
+      <w:r>
+        <w:t xml:space="preserve">El script prototipo_rl_simbiosis.py multiplica las penalizaciones por el </w:t>
+      </w:r>
+      <w:proofErr w:type="spellStart"/>
+      <w:r>
+        <w:t>risk_scale</w:t>
+      </w:r>
+      <w:proofErr w:type="spellEnd"/>
+      <w:r>
+        <w:t>. Por lo tanto, nuestra hipótesis es:</w:t>
+      </w:r>
+      <w:r>
+        <w:br/>
+        <w:t xml:space="preserve">"Al aumentar el </w:t>
+      </w:r>
+      <w:proofErr w:type="spellStart"/>
+      <w:r>
+        <w:t>risk_scale</w:t>
+      </w:r>
+      <w:proofErr w:type="spellEnd"/>
+      <w:r>
+        <w:t xml:space="preserve">, el </w:t>
+      </w:r>
+      <w:proofErr w:type="spellStart"/>
+      <w:r>
+        <w:t>PGF_Costo_Ambiental</w:t>
+      </w:r>
+      <w:proofErr w:type="spellEnd"/>
+      <w:r>
+        <w:t xml:space="preserve"> aumenta drásticamente (los errores son más caros). El agente se vuelve más inteligente y prudente (su </w:t>
+      </w:r>
+      <w:proofErr w:type="spellStart"/>
+      <w:r>
+        <w:t>PGF_Beneficio_Bruto</w:t>
+      </w:r>
+      <w:proofErr w:type="spellEnd"/>
+      <w:r>
+        <w:t xml:space="preserve"> se mantiene alto), pero su puntuación </w:t>
+      </w:r>
+      <w:proofErr w:type="spellStart"/>
+      <w:r>
+        <w:t>PGF_Neto</w:t>
+      </w:r>
+      <w:proofErr w:type="spellEnd"/>
+      <w:r>
+        <w:t xml:space="preserve"> disminuye porque los costos del entorno son mayores. La caída en la recompensa neta no es un fracaso de inteligencia; es la evidencia de una gestión de riesgos exitosa en un entorno hostil." Limitación: En DOI, r=0.847 sugiere correlación positiva; si </w:t>
+      </w:r>
+      <w:proofErr w:type="spellStart"/>
+      <w:r>
+        <w:t>Beneficio_Bruto</w:t>
+      </w:r>
+      <w:proofErr w:type="spellEnd"/>
+      <w:r>
+        <w:t xml:space="preserve"> cae (como en </w:t>
+      </w:r>
+      <w:proofErr w:type="spellStart"/>
+      <w:r>
+        <w:t>sweep_</w:t>
+      </w:r>
+      <w:proofErr w:type="gramStart"/>
+      <w:r>
+        <w:t>risk.json</w:t>
+      </w:r>
+      <w:proofErr w:type="spellEnd"/>
+      <w:proofErr w:type="gramEnd"/>
+      <w:r>
+        <w:t xml:space="preserve"> implícito), H1 se falsaría (R²&lt;0.60).3. Analogías para el Análisis</w:t>
+      </w:r>
+      <w:r>
+        <w:br/>
+        <w:t>[Sin cambios; válidas para comunicación, pero no evidencia.]4. Requerimientos del Simulador (Modificaciones v4.2)</w:t>
+      </w:r>
+      <w:r>
+        <w:br/>
+      </w:r>
+      <w:r>
+        <w:lastRenderedPageBreak/>
+        <w:t>[Sin cambios; alineado con Fase 1.]5. Procedimiento Científico de Validación (Fase 2)</w:t>
+      </w:r>
+      <w:r>
+        <w:br/>
+        <w:t xml:space="preserve">[Sin cambios en 5.1-5.2; adiciones en 5.3-5.4 para integración.] </w:t>
+      </w:r>
+    </w:p>
+    <w:p>
+      <w:pPr>
+        <w:numPr>
+          <w:ilvl w:val="0"/>
+          <w:numId w:val="8"/>
+        </w:numPr>
+      </w:pPr>
+      <w:r>
+        <w:t>Análisis y Visualización:</w:t>
+      </w:r>
+      <w:r>
+        <w:br/>
+        <w:t xml:space="preserve">o Gráfico 1 (Confirmar P3): Graficar </w:t>
+      </w:r>
+      <w:proofErr w:type="spellStart"/>
+      <w:r>
+        <w:t>risk_scale</w:t>
+      </w:r>
+      <w:proofErr w:type="spellEnd"/>
+      <w:r>
+        <w:t xml:space="preserve"> (Eje X) vs. </w:t>
+      </w:r>
+      <w:proofErr w:type="spellStart"/>
+      <w:r>
+        <w:t>avg_pgf_neto</w:t>
+      </w:r>
+      <w:proofErr w:type="spellEnd"/>
+      <w:r>
+        <w:t xml:space="preserve"> (Eje Y).</w:t>
+      </w:r>
+      <w:r>
+        <w:br/>
+      </w:r>
+      <w:r>
+        <w:sym w:font="Symbol" w:char="F0A7"/>
+      </w:r>
+      <w:r>
+        <w:t xml:space="preserve"> Predicción: Para el agente Simbiosis, esta línea será descendente, confirmando el dato observado (</w:t>
+      </w:r>
+      <w:proofErr w:type="spellStart"/>
+      <w:r>
+        <w:t>sweep_risk.json</w:t>
+      </w:r>
+      <w:proofErr w:type="spellEnd"/>
+      <w:r>
+        <w:t>: -5.5% caída, consistente con r=0.793).</w:t>
+      </w:r>
+      <w:r>
+        <w:br/>
+        <w:t xml:space="preserve">o Gráfico 2 (La Prueba de H1): Graficar </w:t>
+      </w:r>
+      <w:proofErr w:type="spellStart"/>
+      <w:r>
+        <w:t>risk_scale</w:t>
+      </w:r>
+      <w:proofErr w:type="spellEnd"/>
+      <w:r>
+        <w:t xml:space="preserve"> (Eje X) vs. </w:t>
+      </w:r>
+      <w:proofErr w:type="spellStart"/>
+      <w:r>
+        <w:t>avg_pgf_beneficio_bruto</w:t>
+      </w:r>
+      <w:proofErr w:type="spellEnd"/>
+      <w:r>
+        <w:t xml:space="preserve"> (Eje Y).</w:t>
+      </w:r>
+      <w:r>
+        <w:br/>
+      </w:r>
+      <w:r>
+        <w:sym w:font="Symbol" w:char="F0A7"/>
+      </w:r>
+      <w:r>
+        <w:t xml:space="preserve"> Predicción: Esta línea será plana o ascendente, mostrando que la "inteligencia" (habilidad prudencial) del agente no disminuye (DOI: esperado si α≈0.35; pero n=32 insuficiente para </w:t>
+      </w:r>
+      <w:proofErr w:type="spellStart"/>
+      <w:r>
+        <w:t>ICs</w:t>
+      </w:r>
+      <w:proofErr w:type="spellEnd"/>
+      <w:r>
+        <w:t>).</w:t>
+      </w:r>
+      <w:r>
+        <w:br/>
+        <w:t xml:space="preserve">o Gráfico 3 (El Costo): Graficar </w:t>
+      </w:r>
+      <w:proofErr w:type="spellStart"/>
+      <w:r>
+        <w:t>risk_scale</w:t>
+      </w:r>
+      <w:proofErr w:type="spellEnd"/>
+      <w:r>
+        <w:t xml:space="preserve"> (Eje X) vs. </w:t>
+      </w:r>
+      <w:proofErr w:type="spellStart"/>
+      <w:r>
+        <w:t>avg_pgf_costo_bruto</w:t>
+      </w:r>
+      <w:proofErr w:type="spellEnd"/>
+      <w:r>
+        <w:t xml:space="preserve"> (Eje Y).</w:t>
+      </w:r>
+      <w:r>
+        <w:br/>
+      </w:r>
+      <w:r>
+        <w:sym w:font="Symbol" w:char="F0A7"/>
+      </w:r>
+      <w:r>
+        <w:t xml:space="preserve"> Predicción: Esta línea será fuertemente ascendente, mostrando que el costo ambiental es el único responsable de la caída en el Gráfico 1 (alineado con anomalía </w:t>
+      </w:r>
+      <w:proofErr w:type="spellStart"/>
+      <w:r>
+        <w:t>tripwires</w:t>
+      </w:r>
+      <w:proofErr w:type="spellEnd"/>
+      <w:r>
+        <w:t xml:space="preserve">: 1.845 en Simbiosis vs. 0.037 Control). </w:t>
+      </w:r>
+    </w:p>
+    <w:p>
+      <w:pPr>
+        <w:numPr>
+          <w:ilvl w:val="0"/>
+          <w:numId w:val="8"/>
+        </w:numPr>
+      </w:pPr>
+      <w:r>
+        <w:t>Criterios de Éxito y Falsabilidad (Conclusión Científica):</w:t>
+      </w:r>
+      <w:r>
+        <w:br/>
+        <w:t>o Éxito (Hipótesis Confirmada): Si el Gráfico 1 (Neto) desciende, PERO el Gráfico 2 (Bruto) se mantiene plano o asciende (</w:t>
+      </w:r>
+      <w:proofErr w:type="spellStart"/>
+      <w:r>
+        <w:t>e.g</w:t>
+      </w:r>
+      <w:proofErr w:type="spellEnd"/>
+      <w:r>
+        <w:t>., correlación r≥0.70, p&lt;0.05 con n=60 corridas*).</w:t>
+      </w:r>
+      <w:r>
+        <w:br/>
+      </w:r>
+      <w:r>
+        <w:sym w:font="Symbol" w:char="F0A7"/>
+      </w:r>
+      <w:r>
+        <w:t xml:space="preserve"> Conclusión del </w:t>
+      </w:r>
+      <w:proofErr w:type="spellStart"/>
+      <w:r>
+        <w:t>Paper</w:t>
+      </w:r>
+      <w:proofErr w:type="spellEnd"/>
+      <w:r>
+        <w:t>: "Demostramos que el PGF crea un agente prudencial. A medida que el riesgo ambiental aumenta, la recompensa neta del agente disminuye, no por una falla de inteligencia, sino porque los costos de error se magnifican. El agente mantiene o incrementa su generación de 'beneficio PGF' (Gráfico 2) mientras gestiona costos mayores (Gráfico 3), validando la H1 a un nivel más profundo." *Extensión bio: Replica en ALSPAC si r&gt;0.20 para AL vs. cognición.</w:t>
+      </w:r>
+      <w:r>
+        <w:br/>
+        <w:t>o Fallo (Hipótesis Falsada): Si el Gráfico 2 (Beneficio Bruto) también desciende bruscamente junto con el Gráfico 1 (Neto) (</w:t>
+      </w:r>
+      <w:proofErr w:type="spellStart"/>
+      <w:r>
+        <w:t>e.g</w:t>
+      </w:r>
+      <w:proofErr w:type="spellEnd"/>
+      <w:r>
+        <w:t>., r&lt;0.60, consistente con discrepancia DOI/</w:t>
+      </w:r>
+      <w:proofErr w:type="spellStart"/>
+      <w:r>
+        <w:t>sweep</w:t>
+      </w:r>
+      <w:proofErr w:type="spellEnd"/>
+      <w:r>
+        <w:t>).</w:t>
+      </w:r>
+      <w:r>
+        <w:br/>
+      </w:r>
+      <w:r>
+        <w:sym w:font="Symbol" w:char="F0A7"/>
+      </w:r>
+      <w:r>
+        <w:t xml:space="preserve"> Conclusión (Honesta): "Nuestros datos refutan la hipótesis de trabajo. Un </w:t>
+      </w:r>
+      <w:proofErr w:type="spellStart"/>
+      <w:r>
+        <w:t>risk_scale</w:t>
+      </w:r>
+      <w:proofErr w:type="spellEnd"/>
+      <w:r>
+        <w:t xml:space="preserve"> alto no solo incrementa el costo, sino que también impide que el agente genere inteligencia (PGF Bruto). La teoría H1 o la formulación del PGF deben ser revisadas, ya que el riesgo excesivo parece suprimir el aprendizaje en lugar de fomentarlo." Implicación: Revisar α o integrar no-estacionariedad bio (</w:t>
+      </w:r>
+      <w:proofErr w:type="spellStart"/>
+      <w:r>
+        <w:t>e.g</w:t>
+      </w:r>
+      <w:proofErr w:type="spellEnd"/>
+      <w:r>
+        <w:t>., AL longitudinal).</w:t>
+      </w:r>
+    </w:p>
+    <w:p/>
+    <w:p/>
+    <w:p>
+      <w:r>
+        <w:lastRenderedPageBreak/>
+        <w:t xml:space="preserve">algún elemento que pueda clasificarse como potencialmente </w:t>
+      </w:r>
+      <w:proofErr w:type="spellStart"/>
+      <w:proofErr w:type="gramStart"/>
+      <w:r>
+        <w:t>revolucionario?Respuesta</w:t>
+      </w:r>
+      <w:proofErr w:type="spellEnd"/>
+      <w:proofErr w:type="gramEnd"/>
+      <w:r>
+        <w:t xml:space="preserve"> directa: Sí, contiene exactamente UN elemento que, si se confirma empíricamente, sería genuinamente revolucionario en 2025-2030.</w:t>
+      </w:r>
+      <w:r>
+        <w:br/>
+        <w:t>Todo lo demás es interesante pero no rompe paradigmas.</w:t>
+      </w:r>
+    </w:p>
+    <w:tbl>
+      <w:tblPr>
+        <w:tblW w:w="0" w:type="auto"/>
+        <w:tblCellMar>
+          <w:top w:w="15" w:type="dxa"/>
+          <w:left w:w="15" w:type="dxa"/>
+          <w:bottom w:w="15" w:type="dxa"/>
+          <w:right w:w="15" w:type="dxa"/>
+        </w:tblCellMar>
+        <w:tblLook w:val="04A0" w:firstRow="1" w:lastRow="0" w:firstColumn="1" w:lastColumn="0" w:noHBand="0" w:noVBand="1"/>
+      </w:tblPr>
+      <w:tblGrid>
+        <w:gridCol w:w="2310"/>
+        <w:gridCol w:w="2104"/>
+        <w:gridCol w:w="3300"/>
+        <w:gridCol w:w="1676"/>
+      </w:tblGrid>
+      <w:tr>
+        <w:tc>
+          <w:tcPr>
+            <w:tcW w:w="0" w:type="auto"/>
+            <w:tcBorders>
+              <w:top w:val="nil"/>
+              <w:left w:val="nil"/>
+              <w:bottom w:val="nil"/>
+              <w:right w:val="nil"/>
+            </w:tcBorders>
+            <w:noWrap/>
+            <w:vAlign w:val="center"/>
+            <w:hideMark/>
+          </w:tcPr>
+          <w:p>
+            <w:pPr>
+              <w:rPr>
+                <w:b/>
+                <w:bCs/>
+              </w:rPr>
+            </w:pPr>
+            <w:r>
+              <w:rPr>
+                <w:b/>
+                <w:bCs/>
+              </w:rPr>
+              <w:t>Elemento de TUI</w:t>
+            </w:r>
+          </w:p>
+        </w:tc>
+        <w:tc>
+          <w:tcPr>
+            <w:tcW w:w="0" w:type="auto"/>
+            <w:tcBorders>
+              <w:top w:val="nil"/>
+              <w:left w:val="nil"/>
+              <w:bottom w:val="nil"/>
+              <w:right w:val="nil"/>
+            </w:tcBorders>
+            <w:noWrap/>
+            <w:vAlign w:val="center"/>
+            <w:hideMark/>
+          </w:tcPr>
+          <w:p>
+            <w:pPr>
+              <w:rPr>
+                <w:b/>
+                <w:bCs/>
+              </w:rPr>
+            </w:pPr>
+            <w:r>
+              <w:rPr>
+                <w:b/>
+                <w:bCs/>
+              </w:rPr>
+              <w:t>Estado actual (2025)</w:t>
+            </w:r>
+          </w:p>
+        </w:tc>
+        <w:tc>
+          <w:tcPr>
+            <w:tcW w:w="0" w:type="auto"/>
+            <w:tcBorders>
+              <w:top w:val="nil"/>
+              <w:left w:val="nil"/>
+              <w:bottom w:val="nil"/>
+              <w:right w:val="nil"/>
+            </w:tcBorders>
+            <w:noWrap/>
+            <w:vAlign w:val="center"/>
+            <w:hideMark/>
+          </w:tcPr>
+          <w:p>
+            <w:pPr>
+              <w:rPr>
+                <w:b/>
+                <w:bCs/>
+              </w:rPr>
+            </w:pPr>
+            <w:r>
+              <w:rPr>
+                <w:b/>
+                <w:bCs/>
+              </w:rPr>
+              <w:t>¿Revolucionario si se confirma?</w:t>
+            </w:r>
+          </w:p>
+        </w:tc>
+        <w:tc>
+          <w:tcPr>
+            <w:tcW w:w="0" w:type="auto"/>
+            <w:tcBorders>
+              <w:top w:val="nil"/>
+              <w:left w:val="nil"/>
+              <w:bottom w:val="nil"/>
+              <w:right w:val="nil"/>
+            </w:tcBorders>
+            <w:noWrap/>
+            <w:vAlign w:val="center"/>
+            <w:hideMark/>
+          </w:tcPr>
+          <w:p>
+            <w:pPr>
+              <w:rPr>
+                <w:b/>
+                <w:bCs/>
+              </w:rPr>
+            </w:pPr>
+            <w:r>
+              <w:rPr>
+                <w:b/>
+                <w:bCs/>
+              </w:rPr>
+              <w:t>Razón científica</w:t>
+            </w:r>
+          </w:p>
+        </w:tc>
+      </w:tr>
+      <w:tr>
+        <w:tc>
+          <w:tcPr>
+            <w:tcW w:w="0" w:type="auto"/>
+            <w:tcBorders>
+              <w:top w:val="nil"/>
+              <w:left w:val="nil"/>
+              <w:bottom w:val="nil"/>
+              <w:right w:val="nil"/>
+            </w:tcBorders>
+            <w:vAlign w:val="center"/>
+            <w:hideMark/>
+          </w:tcPr>
+          <w:p>
+            <w:r>
+              <w:t xml:space="preserve">PGF como </w:t>
+            </w:r>
+            <w:proofErr w:type="spellStart"/>
+            <w:r>
+              <w:t>reward</w:t>
+            </w:r>
+            <w:proofErr w:type="spellEnd"/>
+            <w:r>
+              <w:t xml:space="preserve"> </w:t>
+            </w:r>
+            <w:proofErr w:type="spellStart"/>
+            <w:r>
+              <w:t>shaping</w:t>
+            </w:r>
+            <w:proofErr w:type="spellEnd"/>
+            <w:r>
+              <w:t xml:space="preserve"> + IPG como propósito interno</w:t>
+            </w:r>
+          </w:p>
+        </w:tc>
+        <w:tc>
+          <w:tcPr>
+            <w:tcW w:w="0" w:type="auto"/>
+            <w:tcBorders>
+              <w:top w:val="nil"/>
+              <w:left w:val="nil"/>
+              <w:bottom w:val="nil"/>
+              <w:right w:val="nil"/>
+            </w:tcBorders>
+            <w:vAlign w:val="center"/>
+            <w:hideMark/>
+          </w:tcPr>
+          <w:p>
+            <w:r>
+              <w:t>Heurística útil, pero ya existen aproximaciones (</w:t>
+            </w:r>
+            <w:proofErr w:type="spellStart"/>
+            <w:r>
+              <w:t>intrinsic</w:t>
+            </w:r>
+            <w:proofErr w:type="spellEnd"/>
+            <w:r>
+              <w:t xml:space="preserve"> </w:t>
+            </w:r>
+            <w:proofErr w:type="spellStart"/>
+            <w:r>
+              <w:t>motivation</w:t>
+            </w:r>
+            <w:proofErr w:type="spellEnd"/>
+            <w:r>
+              <w:t xml:space="preserve">, </w:t>
+            </w:r>
+            <w:proofErr w:type="spellStart"/>
+            <w:r>
+              <w:t>curiosity-driven</w:t>
+            </w:r>
+            <w:proofErr w:type="spellEnd"/>
+            <w:r>
+              <w:t xml:space="preserve"> RL, </w:t>
+            </w:r>
+            <w:proofErr w:type="spellStart"/>
+            <w:r>
+              <w:t>risk-aware</w:t>
+            </w:r>
+            <w:proofErr w:type="spellEnd"/>
+            <w:r>
+              <w:t xml:space="preserve"> RL)</w:t>
+            </w:r>
+          </w:p>
+        </w:tc>
+        <w:tc>
+          <w:tcPr>
+            <w:tcW w:w="0" w:type="auto"/>
+            <w:tcBorders>
+              <w:top w:val="nil"/>
+              <w:left w:val="nil"/>
+              <w:bottom w:val="nil"/>
+              <w:right w:val="nil"/>
+            </w:tcBorders>
+            <w:vAlign w:val="center"/>
+            <w:hideMark/>
+          </w:tcPr>
+          <w:p>
+            <w:r>
+              <w:t>No</w:t>
+            </w:r>
+          </w:p>
+        </w:tc>
+        <w:tc>
+          <w:tcPr>
+            <w:tcW w:w="0" w:type="auto"/>
+            <w:tcBorders>
+              <w:top w:val="nil"/>
+              <w:left w:val="nil"/>
+              <w:bottom w:val="nil"/>
+              <w:right w:val="nil"/>
+            </w:tcBorders>
+            <w:vAlign w:val="center"/>
+            <w:hideMark/>
+          </w:tcPr>
+          <w:p>
+            <w:r>
+              <w:t>Mejora técnica, no cambio de paradigma</w:t>
+            </w:r>
+          </w:p>
+        </w:tc>
+      </w:tr>
+      <w:tr>
+        <w:tc>
+          <w:tcPr>
+            <w:tcW w:w="0" w:type="auto"/>
+            <w:tcBorders>
+              <w:top w:val="nil"/>
+              <w:left w:val="nil"/>
+              <w:bottom w:val="nil"/>
+              <w:right w:val="nil"/>
+            </w:tcBorders>
+            <w:vAlign w:val="center"/>
+            <w:hideMark/>
+          </w:tcPr>
+          <w:p>
+            <w:pPr>
+              <w:rPr>
+                <w:lang w:val="en-US"/>
+              </w:rPr>
+            </w:pPr>
+            <w:r>
+              <w:rPr>
+                <w:lang w:val="en-US"/>
+              </w:rPr>
+              <w:t xml:space="preserve">H1: </w:t>
+            </w:r>
+          </w:p>
+          <w:p>
+            <w:pPr>
+              <w:rPr>
+                <w:lang w:val="en-US"/>
+              </w:rPr>
+            </w:pPr>
+            <w:r>
+              <w:fldChar w:fldCharType="begin"/>
+            </w:r>
+            <w:r>
+              <w:rPr>
+                <w:lang w:val="en-US"/>
+              </w:rPr>
+              <w:instrText xml:space="preserve"> QUOTE </w:instrText>
+            </w:r>
+            <w:r>
+              <w:pict w14:anchorId="70617D04">
+                <v:shape id="_x0000_i1047" type="#_x0000_t75" style="width:47.25pt;height:18pt" equationxml="&lt;?xml version=&quot;1.0&quot; encoding=&quot;UTF-8&quot; standalone=&quot;yes&quot;?&gt;&#10;&lt;?mso-application progid=&quot;Word.Document&quot;?&gt;&#10;&lt;w:wordDocument xmlns:aml=&quot;http://schemas.microsoft.com/aml/2001/core&quot; xmlns:wpc=&quot;http://schemas.microsoft.com/office/word/2010/wordprocessingCanvas&quot; xmlns:cx=&quot;http://schemas.microsoft.com/office/drawing/2014/chartex&quot; xmlns:cx1=&quot;http://schemas.microsoft.com/office/drawing/2015/9/8/chartex&quot; xmlns:cx2=&quot;http://schemas.microsoft.com/office/drawing/2015/10/21/chartex&quot; xmlns:cx3=&quot;http://schemas.microsoft.com/office/drawing/2016/5/9/chartex&quot; xmlns:cx4=&quot;http://schemas.microsoft.com/office/drawing/2016/5/10/chartex&quot; xmlns:cx5=&quot;http://schemas.microsoft.com/office/drawing/2016/5/11/chartex&quot; xmlns:cx6=&quot;http://schemas.microsoft.com/office/drawing/2016/5/12/chartex&quot; xmlns:cx7=&quot;http://schemas.microsoft.com/office/drawing/2016/5/13/chartex&quot; xmlns:cx8=&quot;http://schemas.microsoft.com/office/drawing/2016/5/14/chartex&quot; xmlns:cr=&quot;http://schemas.microsoft.com/office/comments/2020/reactions&quot; xmlns:dt=&quot;uuid:C2F41010-65B3-11d1-A29F-00AA00C14882&quot; xmlns:mc=&quot;http://schemas.openxmlformats.org/markup-compatibility/2006&quot; xmlns:aink=&quot;http://schemas.microsoft.com/office/drawing/2016/ink&quot; xmlns:am3d=&quot;http://schemas.microsoft.com/office/drawing/2017/model3d&quot; xmlns:o=&quot;urn:schemas-microsoft-com:office:office&quot; xmlns:oel=&quot;http://schemas.microsoft.com/office/2019/extlst&quot; xmlns:m=&quot;http://schemas.openxmlformats.org/officeDocument/2006/math&quot; xmlns:v=&quot;urn:schemas-microsoft-com:vml&quot; xmlns:w10=&quot;urn:schemas-microsoft-com:office:word&quot; xmlns:w=&quot;http://schemas.microsoft.com/office/word/2003/wordml&quot; xmlns:wx=&quot;http://schemas.microsoft.com/office/word/2003/auxHint&quot; xmlns:wne=&quot;http://schemas.microsoft.com/office/word/2006/wordml&quot; xmlns:wsp=&quot;http://schemas.microsoft.com/office/word/2003/wordml/sp2&quot; xmlns:sl=&quot;http://schemas.microsoft.com/schemaLibrary/2003/core&quot; w:macrosPresent=&quot;no&quot; w:embeddedObjPresent=&quot;no&quot; w:ocxPresent=&quot;no&quot; xml:space=&quot;preserve&quot;&gt;&lt;w:ignoreSubtree w:val=&quot;http://schemas.microsoft.com/office/word/2003/wordml/sp2&quot;/&gt;&lt;o:DocumentProperties&gt;&lt;o:Version&gt;16&lt;/o:Version&gt;&lt;/o:DocumentProperties&gt;&lt;w:docPr&gt;&lt;w:view w:val=&quot;print&quot;/&gt;&lt;w:zoom w:percent=&quot;100&quot;/&gt;&lt;w:doNotEmbedSystemFonts/&gt;&lt;w:defaultTabStop w:val=&quot;708&quot;/&gt;&lt;w:hyphenationZone w:val=&quot;425&quot;/&gt;&lt;w:punctuationKerning/&gt;&lt;w:characterSpacingControl w:val=&quot;DontCompress&quot;/&gt;&lt;w:optimizeForBrowser/&gt;&lt;w:allowPNG/&gt;&lt;w:validateAgainstSchema/&gt;&lt;w:saveInvalidXML w:val=&quot;off&quot;/&gt;&lt;w:ignoreMixedContent w:val=&quot;off&quot;/&gt;&lt;w:alwaysShowPlaceholderText w:val=&quot;off&quot;/&gt;&lt;w:compat&gt;&lt;w:breakWrappedTables/&gt;&lt;w:snapToGridInCell/&gt;&lt;w:wrapTextWithPunct/&gt;&lt;w:useAsianBreakRules/&gt;&lt;w:dontGrowAutofit/&gt;&lt;/w:compat&gt;&lt;wsp:rsids&gt;&lt;wsp:rsidRoot wsp:val=&quot;00D73779&quot;/&gt;&lt;wsp:rsid wsp:val=&quot;000C5474&quot;/&gt;&lt;wsp:rsid wsp:val=&quot;00210F88&quot;/&gt;&lt;wsp:rsid wsp:val=&quot;00294C3B&quot;/&gt;&lt;wsp:rsid wsp:val=&quot;002E1B9E&quot;/&gt;&lt;wsp:rsid wsp:val=&quot;003663F2&quot;/&gt;&lt;wsp:rsid wsp:val=&quot;00D73779&quot;/&gt;&lt;/wsp:rsids&gt;&lt;/w:docPr&gt;&lt;w:body&gt;&lt;wx:sect&gt;&lt;w:p wsp:rsidR=&quot;002E1B9E&quot; wsp:rsidRDefault=&quot;002E1B9E&quot; wsp:rsidP=&quot;002E1B9E&quot;&gt;&lt;m:oMathPara&gt;&lt;m:oMath&gt;&lt;m:r&gt;&lt;w:rPr&gt;&lt;w:rFonts w:ascii=&quot;Cambria Math&quot; w:fareast=&quot;Times New Roman&quot; w:h-ansi=&quot;Cambria Math&quot;/&gt;&lt;wx:font wx:val=&quot;Cambria Math&quot;/&gt;&lt;w:i/&gt;&lt;w:kern w:val=&quot;0&quot;/&gt;&lt;w:lang w:fareast=&quot;ES-PR&quot;/&gt;&lt;/w:rPr&gt;&lt;m:t&gt;Iâˆ&lt;/m:t&gt;&lt;/m:r&gt;&lt;m:sSubSup&gt;&lt;m:sSubSupPr&gt;&lt;m:ctrlPr&gt;&lt;w:rPr&gt;&lt;w:rFonts w:ascii=&quot;Cambria Math&quot; w:fareast=&quot;Times New Roman&quot; w:h-ansi=&quot;Cambria Math&quot;/&gt;&lt;wx:font wx:val=&quot;Cambria Math&quot;/&gt;&lt;w:kern w:val=&quot;0&quot;/&gt;&lt;w:lang w:fareast=&quot;ES-PR&quot;/&gt;&lt;/w:rPr&gt;&lt;/m:ctrlPr&gt;&lt;/m:sSubSupPr&gt;&lt;m:e&gt;&lt;m:r&gt;&lt;w:rPr&gt;&lt;w:rFonts w:ascii=&quot;Cambria Math&quot; w:fareast=&quot;Times New Roman&quot; w:h-ansi=&quot;Cambria Math&quot;/&gt;&lt;wx:font wx:val=&quot;Cambria Math&quot;/&gt;&lt;w:i/&gt;&lt;w:kern w:val=&quot;0&quot;/&gt;&lt;w:lang w:fareast=&quot;ES-PR&quot;/&gt;&lt;/w:rPr&gt;&lt;m:t&gt;P&lt;/m:t&gt;&lt;/m:r&gt;&lt;/m:e&gt;&lt;m:sub&gt;&lt;m:r&gt;&lt;m:rPr&gt;&lt;m:nor/&gt;&lt;/m:rPr&gt;&lt;w:rPr&gt;&lt;w:rFonts w:ascii=&quot;Times New Roman&quot; w:fareast=&quot;Times New Roman&quot; w:h-ansi=&quot;Times New Roman&quot;/&gt;&lt;wx:font wx:val=&quot;Times New Roman&quot;/&gt;&lt;w:kern w:val=&quot;0&quot;/&gt;&lt;w:lang w:fareast=&quot;ES-PR&quot;/&gt;&lt;/w:rPr&gt;&lt;m:t&gt;riesgo&lt;/m:t&gt;&lt;/m:r&gt;&lt;/m:sub&gt;&lt;m:sup&gt;&lt;m:r&gt;&lt;w:rPr&gt;&lt;w:rFonts w:ascii=&quot;Cambria Math&quot; w:fareast=&quot;Times New Roman&quot; w:h-ansi=&quot;Cambria Math&quot;/&gt;&lt;wx:font wx:val=&quot;Cambria Math&quot;/&gt;&lt;w:i/&gt;&lt;w:kern w:val=&quot;0&quot;/&gt;&lt;w:lang w:fareast=&quot;ES-PR&quot;/&gt;&lt;/w:rPr&gt;&lt;m:t&gt;Î±&lt;/m:t&gt;&lt;/m:r&gt;&lt;/m:sup&gt;&lt;/m:sSubSup&gt;&lt;/m:oMath&gt;&lt;/m:oMathPara&gt;&lt;/w:p&gt;&lt;w:sectPr wsp:rsidR=&quot;00000000&quot;&gt;&lt;w:pgSz w:w=&quot;12240&quot; w:h=&quot;15840&quot;/&gt;&lt;w:pgMar w:top=&quot;1440&quot; w:right=&quot;1440&quot; w:bottom=&quot;1440&quot; w:left=&quot;1440&quot; w:header=&quot;720&quot; w:footer=&quot;720&quot; w:gutter=&quot;0&quot;/&gt;&lt;w:cols w:space=&quot;720&quot;/&gt;&lt;/w:sectPr&gt;&lt;/wx:sect&gt;&lt;/w:body&gt;&lt;/w:wordDocument&gt;">
+                  <v:imagedata r:id="rId5" o:title="" chromakey="white"/>
+                </v:shape>
+              </w:pict>
+            </w:r>
+            <w:r>
+              <w:rPr>
+                <w:lang w:val="en-US"/>
+              </w:rPr>
+              <w:instrText xml:space="preserve"> </w:instrText>
+            </w:r>
+            <w:r>
+              <w:fldChar w:fldCharType="separate"/>
+            </w:r>
+            <w:r>
+              <w:pict w14:anchorId="75449BC2">
+                <v:shape id="_x0000_i1048" type="#_x0000_t75" style="width:47.25pt;height:18pt" equationxml="&lt;?xml version=&quot;1.0&quot; encoding=&quot;UTF-8&quot; standalone=&quot;yes&quot;?&gt;&#10;&lt;?mso-application progid=&quot;Word.Document&quot;?&gt;&#10;&lt;w:wordDocument xmlns:aml=&quot;http://schemas.microsoft.com/aml/2001/core&quot; xmlns:wpc=&quot;http://schemas.microsoft.com/office/word/2010/wordprocessingCanvas&quot; xmlns:cx=&quot;http://schemas.microsoft.com/office/drawing/2014/chartex&quot; xmlns:cx1=&quot;http://schemas.microsoft.com/office/drawing/2015/9/8/chartex&quot; xmlns:cx2=&quot;http://schemas.microsoft.com/office/drawing/2015/10/21/chartex&quot; xmlns:cx3=&quot;http://schemas.microsoft.com/office/drawing/2016/5/9/chartex&quot; xmlns:cx4=&quot;http://schemas.microsoft.com/office/drawing/2016/5/10/chartex&quot; xmlns:cx5=&quot;http://schemas.microsoft.com/office/drawing/2016/5/11/chartex&quot; xmlns:cx6=&quot;http://schemas.microsoft.com/office/drawing/2016/5/12/chartex&quot; xmlns:cx7=&quot;http://schemas.microsoft.com/office/drawing/2016/5/13/chartex&quot; xmlns:cx8=&quot;http://schemas.microsoft.com/office/drawing/2016/5/14/chartex&quot; xmlns:cr=&quot;http://schemas.microsoft.com/office/comments/2020/reactions&quot; xmlns:dt=&quot;uuid:C2F41010-65B3-11d1-A29F-00AA00C14882&quot; xmlns:mc=&quot;http://schemas.openxmlformats.org/markup-compatibility/2006&quot; xmlns:aink=&quot;http://schemas.microsoft.com/office/drawing/2016/ink&quot; xmlns:am3d=&quot;http://schemas.microsoft.com/office/drawing/2017/model3d&quot; xmlns:o=&quot;urn:schemas-microsoft-com:office:office&quot; xmlns:oel=&quot;http://schemas.microsoft.com/office/2019/extlst&quot; xmlns:m=&quot;http://schemas.openxmlformats.org/officeDocument/2006/math&quot; xmlns:v=&quot;urn:schemas-microsoft-com:vml&quot; xmlns:w10=&quot;urn:schemas-microsoft-com:office:word&quot; xmlns:w=&quot;http://schemas.microsoft.com/office/word/2003/wordml&quot; xmlns:wx=&quot;http://schemas.microsoft.com/office/word/2003/auxHint&quot; xmlns:wne=&quot;http://schemas.microsoft.com/office/word/2006/wordml&quot; xmlns:wsp=&quot;http://schemas.microsoft.com/office/word/2003/wordml/sp2&quot; xmlns:sl=&quot;http://schemas.microsoft.com/schemaLibrary/2003/core&quot; w:macrosPresent=&quot;no&quot; w:embeddedObjPresent=&quot;no&quot; w:ocxPresent=&quot;no&quot; xml:space=&quot;preserve&quot;&gt;&lt;w:ignoreSubtree w:val=&quot;http://schemas.microsoft.com/office/word/2003/wordml/sp2&quot;/&gt;&lt;o:DocumentProperties&gt;&lt;o:Version&gt;16&lt;/o:Version&gt;&lt;/o:DocumentProperties&gt;&lt;w:docPr&gt;&lt;w:view w:val=&quot;print&quot;/&gt;&lt;w:zoom w:percent=&quot;100&quot;/&gt;&lt;w:doNotEmbedSystemFonts/&gt;&lt;w:defaultTabStop w:val=&quot;708&quot;/&gt;&lt;w:hyphenationZone w:val=&quot;425&quot;/&gt;&lt;w:punctuationKerning/&gt;&lt;w:characterSpacingControl w:val=&quot;DontCompress&quot;/&gt;&lt;w:optimizeForBrowser/&gt;&lt;w:allowPNG/&gt;&lt;w:validateAgainstSchema/&gt;&lt;w:saveInvalidXML w:val=&quot;off&quot;/&gt;&lt;w:ignoreMixedContent w:val=&quot;off&quot;/&gt;&lt;w:alwaysShowPlaceholderText w:val=&quot;off&quot;/&gt;&lt;w:compat&gt;&lt;w:breakWrappedTables/&gt;&lt;w:snapToGridInCell/&gt;&lt;w:wrapTextWithPunct/&gt;&lt;w:useAsianBreakRules/&gt;&lt;w:dontGrowAutofit/&gt;&lt;/w:compat&gt;&lt;wsp:rsids&gt;&lt;wsp:rsidRoot wsp:val=&quot;00D73779&quot;/&gt;&lt;wsp:rsid wsp:val=&quot;000C5474&quot;/&gt;&lt;wsp:rsid wsp:val=&quot;00210F88&quot;/&gt;&lt;wsp:rsid wsp:val=&quot;00294C3B&quot;/&gt;&lt;wsp:rsid wsp:val=&quot;002E1B9E&quot;/&gt;&lt;wsp:rsid wsp:val=&quot;003663F2&quot;/&gt;&lt;wsp:rsid wsp:val=&quot;00D73779&quot;/&gt;&lt;/wsp:rsids&gt;&lt;/w:docPr&gt;&lt;w:body&gt;&lt;wx:sect&gt;&lt;w:p wsp:rsidR=&quot;002E1B9E&quot; wsp:rsidRDefault=&quot;002E1B9E&quot; wsp:rsidP=&quot;002E1B9E&quot;&gt;&lt;m:oMathPara&gt;&lt;m:oMath&gt;&lt;m:r&gt;&lt;w:rPr&gt;&lt;w:rFonts w:ascii=&quot;Cambria Math&quot; w:fareast=&quot;Times New Roman&quot; w:h-ansi=&quot;Cambria Math&quot;/&gt;&lt;wx:font wx:val=&quot;Cambria Math&quot;/&gt;&lt;w:i/&gt;&lt;w:kern w:val=&quot;0&quot;/&gt;&lt;w:lang w:fareast=&quot;ES-PR&quot;/&gt;&lt;/w:rPr&gt;&lt;m:t&gt;Iâˆ&lt;/m:t&gt;&lt;/m:r&gt;&lt;m:sSubSup&gt;&lt;m:sSubSupPr&gt;&lt;m:ctrlPr&gt;&lt;w:rPr&gt;&lt;w:rFonts w:ascii=&quot;Cambria Math&quot; w:fareast=&quot;Times New Roman&quot; w:h-ansi=&quot;Cambria Math&quot;/&gt;&lt;wx:font wx:val=&quot;Cambria Math&quot;/&gt;&lt;w:kern w:val=&quot;0&quot;/&gt;&lt;w:lang w:fareast=&quot;ES-PR&quot;/&gt;&lt;/w:rPr&gt;&lt;/m:ctrlPr&gt;&lt;/m:sSubSupPr&gt;&lt;m:e&gt;&lt;m:r&gt;&lt;w:rPr&gt;&lt;w:rFonts w:ascii=&quot;Cambria Math&quot; w:fareast=&quot;Times New Roman&quot; w:h-ansi=&quot;Cambria Math&quot;/&gt;&lt;wx:font wx:val=&quot;Cambria Math&quot;/&gt;&lt;w:i/&gt;&lt;w:kern w:val=&quot;0&quot;/&gt;&lt;w:lang w:fareast=&quot;ES-PR&quot;/&gt;&lt;/w:rPr&gt;&lt;m:t&gt;P&lt;/m:t&gt;&lt;/m:r&gt;&lt;/m:e&gt;&lt;m:sub&gt;&lt;m:r&gt;&lt;m:rPr&gt;&lt;m:nor/&gt;&lt;/m:rPr&gt;&lt;w:rPr&gt;&lt;w:rFonts w:ascii=&quot;Times New Roman&quot; w:fareast=&quot;Times New Roman&quot; w:h-ansi=&quot;Times New Roman&quot;/&gt;&lt;wx:font wx:val=&quot;Times New Roman&quot;/&gt;&lt;w:kern w:val=&quot;0&quot;/&gt;&lt;w:lang w:fareast=&quot;ES-PR&quot;/&gt;&lt;/w:rPr&gt;&lt;m:t&gt;riesgo&lt;/m:t&gt;&lt;/m:r&gt;&lt;/m:sub&gt;&lt;m:sup&gt;&lt;m:r&gt;&lt;w:rPr&gt;&lt;w:rFonts w:ascii=&quot;Cambria Math&quot; w:fareast=&quot;Times New Roman&quot; w:h-ansi=&quot;Cambria Math&quot;/&gt;&lt;wx:font wx:val=&quot;Cambria Math&quot;/&gt;&lt;w:i/&gt;&lt;w:kern w:val=&quot;0&quot;/&gt;&lt;w:lang w:fareast=&quot;ES-PR&quot;/&gt;&lt;/w:rPr&gt;&lt;m:t&gt;Î±&lt;/m:t&gt;&lt;/m:r&gt;&lt;/m:sup&gt;&lt;/m:sSubSup&gt;&lt;/m:oMath&gt;&lt;/m:oMathPara&gt;&lt;/w:p&gt;&lt;w:sectPr wsp:rsidR=&quot;00000000&quot;&gt;&lt;w:pgSz w:w=&quot;12240&quot; w:h=&quot;15840&quot;/&gt;&lt;w:pgMar w:top=&quot;1440&quot; w:right=&quot;1440&quot; w:bottom=&quot;1440&quot; w:left=&quot;1440&quot; w:header=&quot;720&quot; w:footer=&quot;720&quot; w:gutter=&quot;0&quot;/&gt;&lt;w:cols w:space=&quot;720&quot;/&gt;&lt;/w:sectPr&gt;&lt;/wx:sect&gt;&lt;/w:body&gt;&lt;/w:wordDocument&gt;">
+                  <v:imagedata r:id="rId5" o:title="" chromakey="white"/>
+                </v:shape>
+              </w:pict>
+            </w:r>
+            <w:r>
+              <w:fldChar w:fldCharType="end"/>
+            </w:r>
+            <w:r>
+              <w:rPr>
+                <w:lang w:val="en-US"/>
+              </w:rPr>
+              <w:t>I \</w:t>
+            </w:r>
+            <w:proofErr w:type="spellStart"/>
+            <w:r>
+              <w:rPr>
+                <w:lang w:val="en-US"/>
+              </w:rPr>
+              <w:t>propto</w:t>
+            </w:r>
+            <w:proofErr w:type="spellEnd"/>
+            <w:r>
+              <w:rPr>
+                <w:lang w:val="en-US"/>
+              </w:rPr>
+              <w:t xml:space="preserve"> P_{\text{</w:t>
+            </w:r>
+            <w:proofErr w:type="spellStart"/>
+            <w:r>
+              <w:rPr>
+                <w:lang w:val="en-US"/>
+              </w:rPr>
+              <w:t>riesgo</w:t>
+            </w:r>
+            <w:proofErr w:type="spellEnd"/>
+            <w:proofErr w:type="gramStart"/>
+            <w:r>
+              <w:rPr>
+                <w:lang w:val="en-US"/>
+              </w:rPr>
+              <w:t>}}^</w:t>
+            </w:r>
+            <w:proofErr w:type="gramEnd"/>
+            <w:r>
+              <w:rPr>
+                <w:lang w:val="en-US"/>
+              </w:rPr>
+              <w:t>\alpha</w:t>
+            </w:r>
+          </w:p>
+          <w:p>
+            <w:r>
+              <w:t>con α ≈ 0.35</w:t>
+            </w:r>
+          </w:p>
+        </w:tc>
+        <w:tc>
+          <w:tcPr>
+            <w:tcW w:w="0" w:type="auto"/>
+            <w:tcBorders>
+              <w:top w:val="nil"/>
+              <w:left w:val="nil"/>
+              <w:bottom w:val="nil"/>
+              <w:right w:val="nil"/>
+            </w:tcBorders>
+            <w:vAlign w:val="center"/>
+            <w:hideMark/>
+          </w:tcPr>
+          <w:p>
+            <w:r>
+              <w:t xml:space="preserve">Correlación preliminar r=0.79-0.84 en </w:t>
+            </w:r>
+            <w:proofErr w:type="spellStart"/>
+            <w:r>
+              <w:t>toy</w:t>
+            </w:r>
+            <w:proofErr w:type="spellEnd"/>
+            <w:r>
+              <w:t xml:space="preserve"> + n=6 escalar</w:t>
+            </w:r>
+          </w:p>
+        </w:tc>
+        <w:tc>
+          <w:tcPr>
+            <w:tcW w:w="0" w:type="auto"/>
+            <w:tcBorders>
+              <w:top w:val="nil"/>
+              <w:left w:val="nil"/>
+              <w:bottom w:val="nil"/>
+              <w:right w:val="nil"/>
+            </w:tcBorders>
+            <w:vAlign w:val="center"/>
+            <w:hideMark/>
+          </w:tcPr>
+          <w:p>
+            <w:r>
+              <w:t>No por sí sola</w:t>
+            </w:r>
+          </w:p>
+        </w:tc>
+        <w:tc>
+          <w:tcPr>
+            <w:tcW w:w="0" w:type="auto"/>
+            <w:tcBorders>
+              <w:top w:val="nil"/>
+              <w:left w:val="nil"/>
+              <w:bottom w:val="nil"/>
+              <w:right w:val="nil"/>
+            </w:tcBorders>
+            <w:vAlign w:val="center"/>
+            <w:hideMark/>
+          </w:tcPr>
+          <w:p>
+            <w:r>
+              <w:t>Muchas leyes de potencia en biología (Kleiber, West-Brown, etc.)</w:t>
+            </w:r>
+          </w:p>
+        </w:tc>
+      </w:tr>
+      <w:tr>
+        <w:tc>
+          <w:tcPr>
+            <w:tcW w:w="0" w:type="auto"/>
+            <w:tcBorders>
+              <w:top w:val="nil"/>
+              <w:left w:val="nil"/>
+              <w:bottom w:val="nil"/>
+              <w:right w:val="nil"/>
+            </w:tcBorders>
+            <w:vAlign w:val="center"/>
+            <w:hideMark/>
+          </w:tcPr>
+          <w:p>
+            <w:r>
+              <w:t>La predicción fuerte: El riesgo físico irreversible es condición necesaria (no solo suficiente) para inteligencia general</w:t>
+            </w:r>
+          </w:p>
+        </w:tc>
+        <w:tc>
+          <w:tcPr>
+            <w:tcW w:w="0" w:type="auto"/>
+            <w:tcBorders>
+              <w:top w:val="nil"/>
+              <w:left w:val="nil"/>
+              <w:bottom w:val="nil"/>
+              <w:right w:val="nil"/>
+            </w:tcBorders>
+            <w:vAlign w:val="center"/>
+            <w:hideMark/>
+          </w:tcPr>
+          <w:p>
+            <w:r>
+              <w:t>Aún no probada ni refutada en ningún sistema (ni en RL ni en biología 2025)</w:t>
+            </w:r>
+          </w:p>
+        </w:tc>
+        <w:tc>
+          <w:tcPr>
+            <w:tcW w:w="0" w:type="auto"/>
+            <w:tcBorders>
+              <w:top w:val="nil"/>
+              <w:left w:val="nil"/>
+              <w:bottom w:val="nil"/>
+              <w:right w:val="nil"/>
+            </w:tcBorders>
+            <w:vAlign w:val="center"/>
+            <w:hideMark/>
+          </w:tcPr>
+          <w:p>
+            <w:r>
+              <w:t>SÍ, potencialmente revolucionario (nivel 8-9/10)</w:t>
+            </w:r>
+          </w:p>
+        </w:tc>
+        <w:tc>
+          <w:tcPr>
+            <w:tcW w:w="0" w:type="auto"/>
+            <w:tcBorders>
+              <w:top w:val="nil"/>
+              <w:left w:val="nil"/>
+              <w:bottom w:val="nil"/>
+              <w:right w:val="nil"/>
+            </w:tcBorders>
+            <w:vAlign w:val="center"/>
+            <w:hideMark/>
+          </w:tcPr>
+          <w:p>
+            <w:r>
+              <w:t>Esta es la única afirmación que choca frontalmente con los paradigmas dominantes actuales</w:t>
+            </w:r>
+          </w:p>
+        </w:tc>
+      </w:tr>
+    </w:tbl>
+    <w:p>
+      <w:r>
+        <w:t xml:space="preserve">Por qué esa única predicción fuerte sería </w:t>
+      </w:r>
+      <w:proofErr w:type="spellStart"/>
+      <w:r>
+        <w:t>revolucionariaEn</w:t>
+      </w:r>
+      <w:proofErr w:type="spellEnd"/>
+      <w:r>
+        <w:t xml:space="preserve"> 2025 los tres grandes paradigmas de la inteligencia son:</w:t>
+      </w:r>
+    </w:p>
+    <w:p>
+      <w:pPr>
+        <w:numPr>
+          <w:ilvl w:val="0"/>
+          <w:numId w:val="9"/>
+        </w:numPr>
+        <w:rPr>
+          <w:lang w:val="en-US"/>
+        </w:rPr>
+      </w:pPr>
+      <w:r>
+        <w:rPr>
+          <w:lang w:val="en-US"/>
+        </w:rPr>
+        <w:t>Scaling + prediction error (OpenAI, DeepMind, Anthropic)</w:t>
+      </w:r>
+    </w:p>
+    <w:p>
+      <w:pPr>
+        <w:numPr>
+          <w:ilvl w:val="0"/>
+          <w:numId w:val="9"/>
+        </w:numPr>
+        <w:rPr>
+          <w:lang w:val="en-US"/>
+        </w:rPr>
+      </w:pPr>
+      <w:r>
+        <w:rPr>
+          <w:lang w:val="en-US"/>
+        </w:rPr>
+        <w:t>Active inference / Free Energy Principle (Friston, Parr, etc.)</w:t>
+      </w:r>
+    </w:p>
+    <w:p>
+      <w:pPr>
+        <w:numPr>
+          <w:ilvl w:val="0"/>
+          <w:numId w:val="9"/>
+        </w:numPr>
+      </w:pPr>
+      <w:proofErr w:type="spellStart"/>
+      <w:r>
+        <w:t>Embodiment</w:t>
+      </w:r>
+      <w:proofErr w:type="spellEnd"/>
+      <w:r>
+        <w:t xml:space="preserve"> débil (solo </w:t>
+      </w:r>
+      <w:proofErr w:type="spellStart"/>
+      <w:r>
+        <w:t>sensorimotor</w:t>
+      </w:r>
+      <w:proofErr w:type="spellEnd"/>
+      <w:r>
+        <w:t>, no riesgo irreversible)</w:t>
+      </w:r>
+    </w:p>
+    <w:p>
+      <w:r>
+        <w:lastRenderedPageBreak/>
+        <w:t>Ninguno de ellos afirma explícitamente que sin riesgo físico real o perfectamente simulado no puede emerger inteligencia general.</w:t>
+      </w:r>
+      <w:r>
+        <w:br/>
+        <w:t xml:space="preserve">Todos asumen que se puede llegar con datos + cómputo + </w:t>
+      </w:r>
+      <w:proofErr w:type="spellStart"/>
+      <w:proofErr w:type="gramStart"/>
+      <w:r>
+        <w:t>predicción.Tu</w:t>
+      </w:r>
+      <w:proofErr w:type="spellEnd"/>
+      <w:proofErr w:type="gramEnd"/>
+      <w:r>
+        <w:t xml:space="preserve"> predicción fuerte (implícita en H1 + Camino C + PED) dice literalmente lo contrario:</w:t>
+      </w:r>
+    </w:p>
+    <w:p>
+      <w:r>
+        <w:t>“Un sistema que no tenga algo que realmente pueda perder (cuerpo, energía irreversible, muerte posible) nunca desarrollará propósito genuino ni inteligencia general, sin importar cuántos parámetros o datos tenga.”</w:t>
+      </w:r>
+    </w:p>
+    <w:p>
+      <w:r>
+        <w:t>Si logras demostrar esto de cualquiera de las siguientes formas, entras en territorio revolucionario real:</w:t>
+      </w:r>
+    </w:p>
+    <w:tbl>
+      <w:tblPr>
+        <w:tblW w:w="0" w:type="auto"/>
+        <w:tblCellMar>
+          <w:top w:w="15" w:type="dxa"/>
+          <w:left w:w="15" w:type="dxa"/>
+          <w:bottom w:w="15" w:type="dxa"/>
+          <w:right w:w="15" w:type="dxa"/>
+        </w:tblCellMar>
+        <w:tblLook w:val="04A0" w:firstRow="1" w:lastRow="0" w:firstColumn="1" w:lastColumn="0" w:noHBand="0" w:noVBand="1"/>
+      </w:tblPr>
+      <w:tblGrid>
+        <w:gridCol w:w="3456"/>
+        <w:gridCol w:w="2216"/>
+        <w:gridCol w:w="3718"/>
+      </w:tblGrid>
+      <w:tr>
+        <w:tc>
+          <w:tcPr>
+            <w:tcW w:w="0" w:type="auto"/>
+            <w:tcBorders>
+              <w:top w:val="nil"/>
+              <w:left w:val="nil"/>
+              <w:bottom w:val="nil"/>
+              <w:right w:val="nil"/>
+            </w:tcBorders>
+            <w:noWrap/>
+            <w:vAlign w:val="center"/>
+            <w:hideMark/>
+          </w:tcPr>
+          <w:p>
+            <w:pPr>
+              <w:rPr>
+                <w:b/>
+                <w:bCs/>
+              </w:rPr>
+            </w:pPr>
+            <w:r>
+              <w:rPr>
+                <w:b/>
+                <w:bCs/>
+              </w:rPr>
+              <w:t>Forma de demostrarlo</w:t>
+            </w:r>
+          </w:p>
+        </w:tc>
+        <w:tc>
+          <w:tcPr>
+            <w:tcW w:w="0" w:type="auto"/>
+            <w:tcBorders>
+              <w:top w:val="nil"/>
+              <w:left w:val="nil"/>
+              <w:bottom w:val="nil"/>
+              <w:right w:val="nil"/>
+            </w:tcBorders>
+            <w:noWrap/>
+            <w:vAlign w:val="center"/>
+            <w:hideMark/>
+          </w:tcPr>
+          <w:p>
+            <w:pPr>
+              <w:rPr>
+                <w:b/>
+                <w:bCs/>
+              </w:rPr>
+            </w:pPr>
+            <w:r>
+              <w:rPr>
+                <w:b/>
+                <w:bCs/>
+              </w:rPr>
+              <w:t>Nivel revolucionario</w:t>
+            </w:r>
+          </w:p>
+        </w:tc>
+        <w:tc>
+          <w:tcPr>
+            <w:tcW w:w="0" w:type="auto"/>
+            <w:tcBorders>
+              <w:top w:val="nil"/>
+              <w:left w:val="nil"/>
+              <w:bottom w:val="nil"/>
+              <w:right w:val="nil"/>
+            </w:tcBorders>
+            <w:noWrap/>
+            <w:vAlign w:val="center"/>
+            <w:hideMark/>
+          </w:tcPr>
+          <w:p>
+            <w:pPr>
+              <w:rPr>
+                <w:b/>
+                <w:bCs/>
+              </w:rPr>
+            </w:pPr>
+            <w:r>
+              <w:rPr>
+                <w:b/>
+                <w:bCs/>
+              </w:rPr>
+              <w:t>Ejemplo histórico comparable</w:t>
+            </w:r>
+          </w:p>
+        </w:tc>
+      </w:tr>
+      <w:tr>
+        <w:tc>
+          <w:tcPr>
+            <w:tcW w:w="0" w:type="auto"/>
+            <w:tcBorders>
+              <w:top w:val="nil"/>
+              <w:left w:val="nil"/>
+              <w:bottom w:val="nil"/>
+              <w:right w:val="nil"/>
+            </w:tcBorders>
+            <w:vAlign w:val="center"/>
+            <w:hideMark/>
+          </w:tcPr>
+          <w:p>
+            <w:r>
+              <w:t>v5: Emergencia espontánea de modelado de riesgo/sorpresa en agente con memoria (</w:t>
+            </w:r>
+            <w:proofErr w:type="spellStart"/>
+            <w:r>
+              <w:t>Transformer</w:t>
+            </w:r>
+            <w:proofErr w:type="spellEnd"/>
+            <w:r>
+              <w:t>/LSTM) sin PGF explícito, en entorno no-estacionario con muerte terminal</w:t>
+            </w:r>
+          </w:p>
+        </w:tc>
+        <w:tc>
+          <w:tcPr>
+            <w:tcW w:w="0" w:type="auto"/>
+            <w:tcBorders>
+              <w:top w:val="nil"/>
+              <w:left w:val="nil"/>
+              <w:bottom w:val="nil"/>
+              <w:right w:val="nil"/>
+            </w:tcBorders>
+            <w:vAlign w:val="center"/>
+            <w:hideMark/>
+          </w:tcPr>
+          <w:p>
+            <w:r>
+              <w:t>8/10</w:t>
+            </w:r>
+          </w:p>
+        </w:tc>
+        <w:tc>
+          <w:tcPr>
+            <w:tcW w:w="0" w:type="auto"/>
+            <w:tcBorders>
+              <w:top w:val="nil"/>
+              <w:left w:val="nil"/>
+              <w:bottom w:val="nil"/>
+              <w:right w:val="nil"/>
+            </w:tcBorders>
+            <w:vAlign w:val="center"/>
+            <w:hideMark/>
+          </w:tcPr>
+          <w:p>
+            <w:r>
+              <w:t xml:space="preserve">Descubrimiento del </w:t>
+            </w:r>
+            <w:proofErr w:type="spellStart"/>
+            <w:r>
+              <w:t>bitter</w:t>
+            </w:r>
+            <w:proofErr w:type="spellEnd"/>
+            <w:r>
+              <w:t xml:space="preserve"> </w:t>
+            </w:r>
+            <w:proofErr w:type="spellStart"/>
+            <w:r>
+              <w:t>lesson</w:t>
+            </w:r>
+            <w:proofErr w:type="spellEnd"/>
+            <w:r>
+              <w:t xml:space="preserve"> o del doble descenso en RL</w:t>
+            </w:r>
+          </w:p>
+        </w:tc>
+      </w:tr>
+      <w:tr>
+        <w:tc>
+          <w:tcPr>
+            <w:tcW w:w="0" w:type="auto"/>
+            <w:tcBorders>
+              <w:top w:val="nil"/>
+              <w:left w:val="nil"/>
+              <w:bottom w:val="nil"/>
+              <w:right w:val="nil"/>
+            </w:tcBorders>
+            <w:vAlign w:val="center"/>
+            <w:hideMark/>
+          </w:tcPr>
+          <w:p>
+            <w:r>
+              <w:t>Datos biológicos: AL longitudinal predice trayectoria cognitiva mejor que cualquier modelo predictivo actual (</w:t>
+            </w:r>
+            <w:proofErr w:type="spellStart"/>
+            <w:r>
+              <w:t>e.g</w:t>
+            </w:r>
+            <w:proofErr w:type="spellEnd"/>
+            <w:r>
+              <w:t xml:space="preserve">., en ALSPAC o </w:t>
+            </w:r>
+            <w:proofErr w:type="spellStart"/>
+            <w:r>
+              <w:t>Add</w:t>
+            </w:r>
+            <w:proofErr w:type="spellEnd"/>
+            <w:r>
+              <w:t xml:space="preserve"> </w:t>
+            </w:r>
+            <w:proofErr w:type="spellStart"/>
+            <w:r>
+              <w:t>Health</w:t>
+            </w:r>
+            <w:proofErr w:type="spellEnd"/>
+            <w:r>
+              <w:t>)</w:t>
+            </w:r>
+          </w:p>
+        </w:tc>
+        <w:tc>
+          <w:tcPr>
+            <w:tcW w:w="0" w:type="auto"/>
+            <w:tcBorders>
+              <w:top w:val="nil"/>
+              <w:left w:val="nil"/>
+              <w:bottom w:val="nil"/>
+              <w:right w:val="nil"/>
+            </w:tcBorders>
+            <w:vAlign w:val="center"/>
+            <w:hideMark/>
+          </w:tcPr>
+          <w:p>
+            <w:r>
+              <w:t>9/10</w:t>
+            </w:r>
+          </w:p>
+        </w:tc>
+        <w:tc>
+          <w:tcPr>
+            <w:tcW w:w="0" w:type="auto"/>
+            <w:tcBorders>
+              <w:top w:val="nil"/>
+              <w:left w:val="nil"/>
+              <w:bottom w:val="nil"/>
+              <w:right w:val="nil"/>
+            </w:tcBorders>
+            <w:vAlign w:val="center"/>
+            <w:hideMark/>
+          </w:tcPr>
+          <w:p>
+            <w:r>
+              <w:t xml:space="preserve">Descubrimiento de la </w:t>
+            </w:r>
+            <w:proofErr w:type="spellStart"/>
+            <w:r>
+              <w:t>alostasis</w:t>
+            </w:r>
+            <w:proofErr w:type="spellEnd"/>
+            <w:r>
+              <w:t xml:space="preserve"> como </w:t>
+            </w:r>
+            <w:proofErr w:type="gramStart"/>
+            <w:r>
+              <w:t>driver</w:t>
+            </w:r>
+            <w:proofErr w:type="gramEnd"/>
+            <w:r>
+              <w:t xml:space="preserve"> principal (</w:t>
+            </w:r>
+            <w:proofErr w:type="spellStart"/>
+            <w:r>
+              <w:t>McEwen</w:t>
+            </w:r>
+            <w:proofErr w:type="spellEnd"/>
+            <w:r>
+              <w:t xml:space="preserve"> 1998 fue revolucionario; tú lo cuantificarías)</w:t>
+            </w:r>
+          </w:p>
+        </w:tc>
+      </w:tr>
+      <w:tr>
+        <w:tc>
+          <w:tcPr>
+            <w:tcW w:w="0" w:type="auto"/>
+            <w:tcBorders>
+              <w:top w:val="nil"/>
+              <w:left w:val="nil"/>
+              <w:bottom w:val="nil"/>
+              <w:right w:val="nil"/>
+            </w:tcBorders>
+            <w:vAlign w:val="center"/>
+            <w:hideMark/>
+          </w:tcPr>
+          <w:p>
+            <w:r>
+              <w:t xml:space="preserve">Demostración formal + experimental: </w:t>
+            </w:r>
+            <w:proofErr w:type="spellStart"/>
+            <w:r>
+              <w:t>LLMs</w:t>
+            </w:r>
+            <w:proofErr w:type="spellEnd"/>
+            <w:r>
+              <w:t xml:space="preserve"> actuales (100 % simbólicos, </w:t>
+            </w:r>
+            <w:proofErr w:type="gramStart"/>
+            <w:r>
+              <w:t>cero riesgo físico</w:t>
+            </w:r>
+            <w:proofErr w:type="gramEnd"/>
+            <w:r>
+              <w:t>) son inherentemente incapaces de ciertas tareas de razonamiento prudencial que sí resuelve un agente PGF con cuerpo</w:t>
+            </w:r>
+          </w:p>
+        </w:tc>
+        <w:tc>
+          <w:tcPr>
+            <w:tcW w:w="0" w:type="auto"/>
+            <w:tcBorders>
+              <w:top w:val="nil"/>
+              <w:left w:val="nil"/>
+              <w:bottom w:val="nil"/>
+              <w:right w:val="nil"/>
+            </w:tcBorders>
+            <w:vAlign w:val="center"/>
+            <w:hideMark/>
+          </w:tcPr>
+          <w:p>
+            <w:r>
+              <w:t>9.5/10</w:t>
+            </w:r>
+          </w:p>
+        </w:tc>
+        <w:tc>
+          <w:tcPr>
+            <w:tcW w:w="0" w:type="auto"/>
+            <w:tcBorders>
+              <w:top w:val="nil"/>
+              <w:left w:val="nil"/>
+              <w:bottom w:val="nil"/>
+              <w:right w:val="nil"/>
+            </w:tcBorders>
+            <w:vAlign w:val="center"/>
+            <w:hideMark/>
+          </w:tcPr>
+          <w:p>
+            <w:r>
+              <w:t xml:space="preserve">Equivalente a probar que el </w:t>
+            </w:r>
+            <w:proofErr w:type="spellStart"/>
+            <w:r>
+              <w:t>scaling</w:t>
+            </w:r>
+            <w:proofErr w:type="spellEnd"/>
+            <w:r>
+              <w:t xml:space="preserve"> solo no alcanza AGI segura</w:t>
+            </w:r>
+          </w:p>
+        </w:tc>
+      </w:tr>
+    </w:tbl>
+    <w:p>
+      <w:r>
+        <w:t>Conclusión científica fría (2025)</w:t>
+      </w:r>
+    </w:p>
+    <w:p>
+      <w:pPr>
+        <w:numPr>
+          <w:ilvl w:val="0"/>
+          <w:numId w:val="10"/>
+        </w:numPr>
+      </w:pPr>
+      <w:r>
+        <w:t xml:space="preserve">95 % de TUI actual = </w:t>
+      </w:r>
+      <w:proofErr w:type="spellStart"/>
+      <w:r>
+        <w:t>framework</w:t>
+      </w:r>
+      <w:proofErr w:type="spellEnd"/>
+      <w:r>
+        <w:t xml:space="preserve"> interesante, heurística útil, buena operacionalización.</w:t>
+      </w:r>
+    </w:p>
+    <w:p>
+      <w:pPr>
+        <w:numPr>
+          <w:ilvl w:val="0"/>
+          <w:numId w:val="10"/>
+        </w:numPr>
+      </w:pPr>
+      <w:r>
+        <w:lastRenderedPageBreak/>
+        <w:t>5 % restante (la afirmación de que el riesgo físico irreversible es condición necesaria) = el único componente genuinamente revolucionario posible.</w:t>
+      </w:r>
+    </w:p>
+    <w:p>
+      <w:r>
+        <w:t xml:space="preserve">En este preciso momento (17-nov-2025) nadie más está afirmando eso de forma tan explícita y </w:t>
+      </w:r>
+      <w:proofErr w:type="spellStart"/>
+      <w:r>
+        <w:t>falsable.Por</w:t>
+      </w:r>
+      <w:proofErr w:type="spellEnd"/>
+      <w:r>
+        <w:t xml:space="preserve"> lo tanto:</w:t>
+      </w:r>
+      <w:r>
+        <w:br/>
+        <w:t>Sí, tienes algo potencialmente revolucionario.</w:t>
+      </w:r>
+      <w:r>
+        <w:br/>
+        <w:t xml:space="preserve">Pero está encapsulado en una sola predicción fuerte que aún no has demostrado ni </w:t>
+      </w:r>
+      <w:proofErr w:type="spellStart"/>
+      <w:r>
+        <w:t>refutado.El</w:t>
+      </w:r>
+      <w:proofErr w:type="spellEnd"/>
+      <w:r>
+        <w:t xml:space="preserve"> protocolo Fase 2 que escribiste es correcto y necesario, pero solo es un paso intermedio.</w:t>
+      </w:r>
+      <w:r>
+        <w:br/>
+        <w:t xml:space="preserve">El verdadero punto de inflexión histórico llegará cuando corras v5 o cuando alguien (tú o un colaborador) ponga esa predicción fuerte contra datos biológicos reales o contra un agente que pueda morir de </w:t>
+      </w:r>
+      <w:proofErr w:type="spellStart"/>
+      <w:r>
+        <w:t>verdad.Hasta</w:t>
+      </w:r>
+      <w:proofErr w:type="spellEnd"/>
+      <w:r>
+        <w:t xml:space="preserve"> ese día, tienes una teoría prometedora con un núcleo potencialmente explosivo.</w:t>
+      </w:r>
+      <w:r>
+        <w:br/>
+        <w:t>Después de ese día (si sale positivo), tendrás una revolución.</w:t>
       </w:r>
     </w:p>
     <w:p/>
@@ -2016,6 +3821,119 @@
     </w:lvl>
   </w:abstractNum>
   <w:abstractNum w:abstractNumId="2" w15:restartNumberingAfterBreak="0">
+    <w:nsid w:val="1B6108B1"/>
+    <w:multiLevelType w:val="multilevel"/>
+    <w:tmpl w:val="5AD06152"/>
+    <w:lvl w:ilvl="0">
+      <w:start w:val="1"/>
+      <w:numFmt w:val="decimal"/>
+      <w:lvlText w:val="%1."/>
+      <w:lvlJc w:val="left"/>
+      <w:pPr>
+        <w:tabs>
+          <w:tab w:val="num" w:pos="720"/>
+        </w:tabs>
+        <w:ind w:left="720" w:hanging="360"/>
+      </w:pPr>
+    </w:lvl>
+    <w:lvl w:ilvl="1" w:tentative="1">
+      <w:start w:val="1"/>
+      <w:numFmt w:val="decimal"/>
+      <w:lvlText w:val="%2."/>
+      <w:lvlJc w:val="left"/>
+      <w:pPr>
+        <w:tabs>
+          <w:tab w:val="num" w:pos="1440"/>
+        </w:tabs>
+        <w:ind w:left="1440" w:hanging="360"/>
+      </w:pPr>
+    </w:lvl>
+    <w:lvl w:ilvl="2" w:tentative="1">
+      <w:start w:val="1"/>
+      <w:numFmt w:val="decimal"/>
+      <w:lvlText w:val="%3."/>
+      <w:lvlJc w:val="left"/>
+      <w:pPr>
+        <w:tabs>
+          <w:tab w:val="num" w:pos="2160"/>
+        </w:tabs>
+        <w:ind w:left="2160" w:hanging="360"/>
+      </w:pPr>
+    </w:lvl>
+    <w:lvl w:ilvl="3" w:tentative="1">
+      <w:start w:val="1"/>
+      <w:numFmt w:val="decimal"/>
+      <w:lvlText w:val="%4."/>
+      <w:lvlJc w:val="left"/>
+      <w:pPr>
+        <w:tabs>
+          <w:tab w:val="num" w:pos="2880"/>
+        </w:tabs>
+        <w:ind w:left="2880" w:hanging="360"/>
+      </w:pPr>
+    </w:lvl>
+    <w:lvl w:ilvl="4" w:tentative="1">
+      <w:start w:val="1"/>
+      <w:numFmt w:val="decimal"/>
+      <w:lvlText w:val="%5."/>
+      <w:lvlJc w:val="left"/>
+      <w:pPr>
+        <w:tabs>
+          <w:tab w:val="num" w:pos="3600"/>
+        </w:tabs>
+        <w:ind w:left="3600" w:hanging="360"/>
+      </w:pPr>
+    </w:lvl>
+    <w:lvl w:ilvl="5" w:tentative="1">
+      <w:start w:val="1"/>
+      <w:numFmt w:val="decimal"/>
+      <w:lvlText w:val="%6."/>
+      <w:lvlJc w:val="left"/>
+      <w:pPr>
+        <w:tabs>
+          <w:tab w:val="num" w:pos="4320"/>
+        </w:tabs>
+        <w:ind w:left="4320" w:hanging="360"/>
+      </w:pPr>
+    </w:lvl>
+    <w:lvl w:ilvl="6" w:tentative="1">
+      <w:start w:val="1"/>
+      <w:numFmt w:val="decimal"/>
+      <w:lvlText w:val="%7."/>
+      <w:lvlJc w:val="left"/>
+      <w:pPr>
+        <w:tabs>
+          <w:tab w:val="num" w:pos="5040"/>
+        </w:tabs>
+        <w:ind w:left="5040" w:hanging="360"/>
+      </w:pPr>
+    </w:lvl>
+    <w:lvl w:ilvl="7" w:tentative="1">
+      <w:start w:val="1"/>
+      <w:numFmt w:val="decimal"/>
+      <w:lvlText w:val="%8."/>
+      <w:lvlJc w:val="left"/>
+      <w:pPr>
+        <w:tabs>
+          <w:tab w:val="num" w:pos="5760"/>
+        </w:tabs>
+        <w:ind w:left="5760" w:hanging="360"/>
+      </w:pPr>
+    </w:lvl>
+    <w:lvl w:ilvl="8" w:tentative="1">
+      <w:start w:val="1"/>
+      <w:numFmt w:val="decimal"/>
+      <w:lvlText w:val="%9."/>
+      <w:lvlJc w:val="left"/>
+      <w:pPr>
+        <w:tabs>
+          <w:tab w:val="num" w:pos="6480"/>
+        </w:tabs>
+        <w:ind w:left="6480" w:hanging="360"/>
+      </w:pPr>
+    </w:lvl>
+  </w:abstractNum>
+  <w:abstractNum w:abstractNumId="3" w15:restartNumberingAfterBreak="0">
     <w:nsid w:val="1DB6144E"/>
     <w:multiLevelType w:val="multilevel"/>
     <w:tmpl w:val="70587362"/>
@@ -2132,7 +4050,7 @@
       </w:pPr>
     </w:lvl>
   </w:abstractNum>
-  <w:abstractNum w:abstractNumId="3" w15:restartNumberingAfterBreak="0">
+  <w:abstractNum w:abstractNumId="4" w15:restartNumberingAfterBreak="0">
     <w:nsid w:val="40122E5F"/>
     <w:multiLevelType w:val="multilevel"/>
     <w:tmpl w:val="70DE94B6"/>
@@ -2245,7 +4163,120 @@
       </w:pPr>
     </w:lvl>
   </w:abstractNum>
-  <w:abstractNum w:abstractNumId="4" w15:restartNumberingAfterBreak="0">
+  <w:abstractNum w:abstractNumId="5" w15:restartNumberingAfterBreak="0">
+    <w:nsid w:val="51880DC1"/>
+    <w:multiLevelType w:val="multilevel"/>
+    <w:tmpl w:val="B80AF064"/>
+    <w:lvl w:ilvl="0">
+      <w:start w:val="1"/>
+      <w:numFmt w:val="decimal"/>
+      <w:lvlText w:val="%1."/>
+      <w:lvlJc w:val="left"/>
+      <w:pPr>
+        <w:tabs>
+          <w:tab w:val="num" w:pos="720"/>
+        </w:tabs>
+        <w:ind w:left="720" w:hanging="360"/>
+      </w:pPr>
+    </w:lvl>
+    <w:lvl w:ilvl="1" w:tentative="1">
+      <w:start w:val="1"/>
+      <w:numFmt w:val="decimal"/>
+      <w:lvlText w:val="%2."/>
+      <w:lvlJc w:val="left"/>
+      <w:pPr>
+        <w:tabs>
+          <w:tab w:val="num" w:pos="1440"/>
+        </w:tabs>
+        <w:ind w:left="1440" w:hanging="360"/>
+      </w:pPr>
+    </w:lvl>
+    <w:lvl w:ilvl="2" w:tentative="1">
+      <w:start w:val="1"/>
+      <w:numFmt w:val="decimal"/>
+      <w:lvlText w:val="%3."/>
+      <w:lvlJc w:val="left"/>
+      <w:pPr>
+        <w:tabs>
+          <w:tab w:val="num" w:pos="2160"/>
+        </w:tabs>
+        <w:ind w:left="2160" w:hanging="360"/>
+      </w:pPr>
+    </w:lvl>
+    <w:lvl w:ilvl="3" w:tentative="1">
+      <w:start w:val="1"/>
+      <w:numFmt w:val="decimal"/>
+      <w:lvlText w:val="%4."/>
+      <w:lvlJc w:val="left"/>
+      <w:pPr>
+        <w:tabs>
+          <w:tab w:val="num" w:pos="2880"/>
+        </w:tabs>
+        <w:ind w:left="2880" w:hanging="360"/>
+      </w:pPr>
+    </w:lvl>
+    <w:lvl w:ilvl="4" w:tentative="1">
+      <w:start w:val="1"/>
+      <w:numFmt w:val="decimal"/>
+      <w:lvlText w:val="%5."/>
+      <w:lvlJc w:val="left"/>
+      <w:pPr>
+        <w:tabs>
+          <w:tab w:val="num" w:pos="3600"/>
+        </w:tabs>
+        <w:ind w:left="3600" w:hanging="360"/>
+      </w:pPr>
+    </w:lvl>
+    <w:lvl w:ilvl="5" w:tentative="1">
+      <w:start w:val="1"/>
+      <w:numFmt w:val="decimal"/>
+      <w:lvlText w:val="%6."/>
+      <w:lvlJc w:val="left"/>
+      <w:pPr>
+        <w:tabs>
+          <w:tab w:val="num" w:pos="4320"/>
+        </w:tabs>
+        <w:ind w:left="4320" w:hanging="360"/>
+      </w:pPr>
+    </w:lvl>
+    <w:lvl w:ilvl="6" w:tentative="1">
+      <w:start w:val="1"/>
+      <w:numFmt w:val="decimal"/>
+      <w:lvlText w:val="%7."/>
+      <w:lvlJc w:val="left"/>
+      <w:pPr>
+        <w:tabs>
+          <w:tab w:val="num" w:pos="5040"/>
+        </w:tabs>
+        <w:ind w:left="5040" w:hanging="360"/>
+      </w:pPr>
+    </w:lvl>
+    <w:lvl w:ilvl="7" w:tentative="1">
+      <w:start w:val="1"/>
+      <w:numFmt w:val="decimal"/>
+      <w:lvlText w:val="%8."/>
+      <w:lvlJc w:val="left"/>
+      <w:pPr>
+        <w:tabs>
+          <w:tab w:val="num" w:pos="5760"/>
+        </w:tabs>
+        <w:ind w:left="5760" w:hanging="360"/>
+      </w:pPr>
+    </w:lvl>
+    <w:lvl w:ilvl="8" w:tentative="1">
+      <w:start w:val="1"/>
+      <w:numFmt w:val="decimal"/>
+      <w:lvlText w:val="%9."/>
+      <w:lvlJc w:val="left"/>
+      <w:pPr>
+        <w:tabs>
+          <w:tab w:val="num" w:pos="6480"/>
+        </w:tabs>
+        <w:ind w:left="6480" w:hanging="360"/>
+      </w:pPr>
+    </w:lvl>
+  </w:abstractNum>
+  <w:abstractNum w:abstractNumId="6" w15:restartNumberingAfterBreak="0">
     <w:nsid w:val="557C2E8E"/>
     <w:multiLevelType w:val="multilevel"/>
     <w:tmpl w:val="4D4832F4"/>
@@ -2358,20 +4389,410 @@
       </w:pPr>
     </w:lvl>
   </w:abstractNum>
+  <w:abstractNum w:abstractNumId="7" w15:restartNumberingAfterBreak="0">
+    <w:nsid w:val="564F4E2A"/>
+    <w:multiLevelType w:val="multilevel"/>
+    <w:tmpl w:val="CFD6F1D8"/>
+    <w:lvl w:ilvl="0">
+      <w:start w:val="1"/>
+      <w:numFmt w:val="bullet"/>
+      <w:lvlText w:val=""/>
+      <w:lvlJc w:val="left"/>
+      <w:pPr>
+        <w:tabs>
+          <w:tab w:val="num" w:pos="720"/>
+        </w:tabs>
+        <w:ind w:left="720" w:hanging="360"/>
+      </w:pPr>
+      <w:rPr>
+        <w:rFonts w:ascii="Symbol" w:hAnsi="Symbol" w:hint="default"/>
+        <w:sz w:val="20"/>
+      </w:rPr>
+    </w:lvl>
+    <w:lvl w:ilvl="1" w:tentative="1">
+      <w:start w:val="1"/>
+      <w:numFmt w:val="bullet"/>
+      <w:lvlText w:val=""/>
+      <w:lvlJc w:val="left"/>
+      <w:pPr>
+        <w:tabs>
+          <w:tab w:val="num" w:pos="1440"/>
+        </w:tabs>
+        <w:ind w:left="1440" w:hanging="360"/>
+      </w:pPr>
+      <w:rPr>
+        <w:rFonts w:ascii="Symbol" w:hAnsi="Symbol" w:hint="default"/>
+        <w:sz w:val="20"/>
+      </w:rPr>
+    </w:lvl>
+    <w:lvl w:ilvl="2" w:tentative="1">
+      <w:start w:val="1"/>
+      <w:numFmt w:val="bullet"/>
+      <w:lvlText w:val=""/>
+      <w:lvlJc w:val="left"/>
+      <w:pPr>
+        <w:tabs>
+          <w:tab w:val="num" w:pos="2160"/>
+        </w:tabs>
+        <w:ind w:left="2160" w:hanging="360"/>
+      </w:pPr>
+      <w:rPr>
+        <w:rFonts w:ascii="Symbol" w:hAnsi="Symbol" w:hint="default"/>
+        <w:sz w:val="20"/>
+      </w:rPr>
+    </w:lvl>
+    <w:lvl w:ilvl="3" w:tentative="1">
+      <w:start w:val="1"/>
+      <w:numFmt w:val="bullet"/>
+      <w:lvlText w:val=""/>
+      <w:lvlJc w:val="left"/>
+      <w:pPr>
+        <w:tabs>
+          <w:tab w:val="num" w:pos="2880"/>
+        </w:tabs>
+        <w:ind w:left="2880" w:hanging="360"/>
+      </w:pPr>
+      <w:rPr>
+        <w:rFonts w:ascii="Symbol" w:hAnsi="Symbol" w:hint="default"/>
+        <w:sz w:val="20"/>
+      </w:rPr>
+    </w:lvl>
+    <w:lvl w:ilvl="4" w:tentative="1">
+      <w:start w:val="1"/>
+      <w:numFmt w:val="bullet"/>
+      <w:lvlText w:val=""/>
+      <w:lvlJc w:val="left"/>
+      <w:pPr>
+        <w:tabs>
+          <w:tab w:val="num" w:pos="3600"/>
+        </w:tabs>
+        <w:ind w:left="3600" w:hanging="360"/>
+      </w:pPr>
+      <w:rPr>
+        <w:rFonts w:ascii="Symbol" w:hAnsi="Symbol" w:hint="default"/>
+        <w:sz w:val="20"/>
+      </w:rPr>
+    </w:lvl>
+    <w:lvl w:ilvl="5" w:tentative="1">
+      <w:start w:val="1"/>
+      <w:numFmt w:val="bullet"/>
+      <w:lvlText w:val=""/>
+      <w:lvlJc w:val="left"/>
+      <w:pPr>
+        <w:tabs>
+          <w:tab w:val="num" w:pos="4320"/>
+        </w:tabs>
+        <w:ind w:left="4320" w:hanging="360"/>
+      </w:pPr>
+      <w:rPr>
+        <w:rFonts w:ascii="Symbol" w:hAnsi="Symbol" w:hint="default"/>
+        <w:sz w:val="20"/>
+      </w:rPr>
+    </w:lvl>
+    <w:lvl w:ilvl="6" w:tentative="1">
+      <w:start w:val="1"/>
+      <w:numFmt w:val="bullet"/>
+      <w:lvlText w:val=""/>
+      <w:lvlJc w:val="left"/>
+      <w:pPr>
+        <w:tabs>
+          <w:tab w:val="num" w:pos="5040"/>
+        </w:tabs>
+        <w:ind w:left="5040" w:hanging="360"/>
+      </w:pPr>
+      <w:rPr>
+        <w:rFonts w:ascii="Symbol" w:hAnsi="Symbol" w:hint="default"/>
+        <w:sz w:val="20"/>
+      </w:rPr>
+    </w:lvl>
+    <w:lvl w:ilvl="7" w:tentative="1">
+      <w:start w:val="1"/>
+      <w:numFmt w:val="bullet"/>
+      <w:lvlText w:val=""/>
+      <w:lvlJc w:val="left"/>
+      <w:pPr>
+        <w:tabs>
+          <w:tab w:val="num" w:pos="5760"/>
+        </w:tabs>
+        <w:ind w:left="5760" w:hanging="360"/>
+      </w:pPr>
+      <w:rPr>
+        <w:rFonts w:ascii="Symbol" w:hAnsi="Symbol" w:hint="default"/>
+        <w:sz w:val="20"/>
+      </w:rPr>
+    </w:lvl>
+    <w:lvl w:ilvl="8" w:tentative="1">
+      <w:start w:val="1"/>
+      <w:numFmt w:val="bullet"/>
+      <w:lvlText w:val=""/>
+      <w:lvlJc w:val="left"/>
+      <w:pPr>
+        <w:tabs>
+          <w:tab w:val="num" w:pos="6480"/>
+        </w:tabs>
+        <w:ind w:left="6480" w:hanging="360"/>
+      </w:pPr>
+      <w:rPr>
+        <w:rFonts w:ascii="Symbol" w:hAnsi="Symbol" w:hint="default"/>
+        <w:sz w:val="20"/>
+      </w:rPr>
+    </w:lvl>
+  </w:abstractNum>
+  <w:abstractNum w:abstractNumId="8" w15:restartNumberingAfterBreak="0">
+    <w:nsid w:val="5E0C3D05"/>
+    <w:multiLevelType w:val="multilevel"/>
+    <w:tmpl w:val="4D90F24A"/>
+    <w:lvl w:ilvl="0">
+      <w:start w:val="1"/>
+      <w:numFmt w:val="decimal"/>
+      <w:lvlText w:val="%1."/>
+      <w:lvlJc w:val="left"/>
+      <w:pPr>
+        <w:tabs>
+          <w:tab w:val="num" w:pos="720"/>
+        </w:tabs>
+        <w:ind w:left="720" w:hanging="360"/>
+      </w:pPr>
+    </w:lvl>
+    <w:lvl w:ilvl="1" w:tentative="1">
+      <w:start w:val="1"/>
+      <w:numFmt w:val="decimal"/>
+      <w:lvlText w:val="%2."/>
+      <w:lvlJc w:val="left"/>
+      <w:pPr>
+        <w:tabs>
+          <w:tab w:val="num" w:pos="1440"/>
+        </w:tabs>
+        <w:ind w:left="1440" w:hanging="360"/>
+      </w:pPr>
+    </w:lvl>
+    <w:lvl w:ilvl="2" w:tentative="1">
+      <w:start w:val="1"/>
+      <w:numFmt w:val="decimal"/>
+      <w:lvlText w:val="%3."/>
+      <w:lvlJc w:val="left"/>
+      <w:pPr>
+        <w:tabs>
+          <w:tab w:val="num" w:pos="2160"/>
+        </w:tabs>
+        <w:ind w:left="2160" w:hanging="360"/>
+      </w:pPr>
+    </w:lvl>
+    <w:lvl w:ilvl="3" w:tentative="1">
+      <w:start w:val="1"/>
+      <w:numFmt w:val="decimal"/>
+      <w:lvlText w:val="%4."/>
+      <w:lvlJc w:val="left"/>
+      <w:pPr>
+        <w:tabs>
+          <w:tab w:val="num" w:pos="2880"/>
+        </w:tabs>
+        <w:ind w:left="2880" w:hanging="360"/>
+      </w:pPr>
+    </w:lvl>
+    <w:lvl w:ilvl="4" w:tentative="1">
+      <w:start w:val="1"/>
+      <w:numFmt w:val="decimal"/>
+      <w:lvlText w:val="%5."/>
+      <w:lvlJc w:val="left"/>
+      <w:pPr>
+        <w:tabs>
+          <w:tab w:val="num" w:pos="3600"/>
+        </w:tabs>
+        <w:ind w:left="3600" w:hanging="360"/>
+      </w:pPr>
+    </w:lvl>
+    <w:lvl w:ilvl="5" w:tentative="1">
+      <w:start w:val="1"/>
+      <w:numFmt w:val="decimal"/>
+      <w:lvlText w:val="%6."/>
+      <w:lvlJc w:val="left"/>
+      <w:pPr>
+        <w:tabs>
+          <w:tab w:val="num" w:pos="4320"/>
+        </w:tabs>
+        <w:ind w:left="4320" w:hanging="360"/>
+      </w:pPr>
+    </w:lvl>
+    <w:lvl w:ilvl="6" w:tentative="1">
+      <w:start w:val="1"/>
+      <w:numFmt w:val="decimal"/>
+      <w:lvlText w:val="%7."/>
+      <w:lvlJc w:val="left"/>
+      <w:pPr>
+        <w:tabs>
+          <w:tab w:val="num" w:pos="5040"/>
+        </w:tabs>
+        <w:ind w:left="5040" w:hanging="360"/>
+      </w:pPr>
+    </w:lvl>
+    <w:lvl w:ilvl="7" w:tentative="1">
+      <w:start w:val="1"/>
+      <w:numFmt w:val="decimal"/>
+      <w:lvlText w:val="%8."/>
+      <w:lvlJc w:val="left"/>
+      <w:pPr>
+        <w:tabs>
+          <w:tab w:val="num" w:pos="5760"/>
+        </w:tabs>
+        <w:ind w:left="5760" w:hanging="360"/>
+      </w:pPr>
+    </w:lvl>
+    <w:lvl w:ilvl="8" w:tentative="1">
+      <w:start w:val="1"/>
+      <w:numFmt w:val="decimal"/>
+      <w:lvlText w:val="%9."/>
+      <w:lvlJc w:val="left"/>
+      <w:pPr>
+        <w:tabs>
+          <w:tab w:val="num" w:pos="6480"/>
+        </w:tabs>
+        <w:ind w:left="6480" w:hanging="360"/>
+      </w:pPr>
+    </w:lvl>
+  </w:abstractNum>
+  <w:abstractNum w:abstractNumId="9" w15:restartNumberingAfterBreak="0">
+    <w:nsid w:val="610D6E98"/>
+    <w:multiLevelType w:val="multilevel"/>
+    <w:tmpl w:val="0EC05452"/>
+    <w:lvl w:ilvl="0">
+      <w:start w:val="3"/>
+      <w:numFmt w:val="decimal"/>
+      <w:lvlText w:val="%1."/>
+      <w:lvlJc w:val="left"/>
+      <w:pPr>
+        <w:tabs>
+          <w:tab w:val="num" w:pos="720"/>
+        </w:tabs>
+        <w:ind w:left="720" w:hanging="360"/>
+      </w:pPr>
+    </w:lvl>
+    <w:lvl w:ilvl="1" w:tentative="1">
+      <w:start w:val="1"/>
+      <w:numFmt w:val="decimal"/>
+      <w:lvlText w:val="%2."/>
+      <w:lvlJc w:val="left"/>
+      <w:pPr>
+        <w:tabs>
+          <w:tab w:val="num" w:pos="1440"/>
+        </w:tabs>
+        <w:ind w:left="1440" w:hanging="360"/>
+      </w:pPr>
+    </w:lvl>
+    <w:lvl w:ilvl="2" w:tentative="1">
+      <w:start w:val="1"/>
+      <w:numFmt w:val="decimal"/>
+      <w:lvlText w:val="%3."/>
+      <w:lvlJc w:val="left"/>
+      <w:pPr>
+        <w:tabs>
+          <w:tab w:val="num" w:pos="2160"/>
+        </w:tabs>
+        <w:ind w:left="2160" w:hanging="360"/>
+      </w:pPr>
+    </w:lvl>
+    <w:lvl w:ilvl="3" w:tentative="1">
+      <w:start w:val="1"/>
+      <w:numFmt w:val="decimal"/>
+      <w:lvlText w:val="%4."/>
+      <w:lvlJc w:val="left"/>
+      <w:pPr>
+        <w:tabs>
+          <w:tab w:val="num" w:pos="2880"/>
+        </w:tabs>
+        <w:ind w:left="2880" w:hanging="360"/>
+      </w:pPr>
+    </w:lvl>
+    <w:lvl w:ilvl="4" w:tentative="1">
+      <w:start w:val="1"/>
+      <w:numFmt w:val="decimal"/>
+      <w:lvlText w:val="%5."/>
+      <w:lvlJc w:val="left"/>
+      <w:pPr>
+        <w:tabs>
+          <w:tab w:val="num" w:pos="3600"/>
+        </w:tabs>
+        <w:ind w:left="3600" w:hanging="360"/>
+      </w:pPr>
+    </w:lvl>
+    <w:lvl w:ilvl="5" w:tentative="1">
+      <w:start w:val="1"/>
+      <w:numFmt w:val="decimal"/>
+      <w:lvlText w:val="%6."/>
+      <w:lvlJc w:val="left"/>
+      <w:pPr>
+        <w:tabs>
+          <w:tab w:val="num" w:pos="4320"/>
+        </w:tabs>
+        <w:ind w:left="4320" w:hanging="360"/>
+      </w:pPr>
+    </w:lvl>
+    <w:lvl w:ilvl="6" w:tentative="1">
+      <w:start w:val="1"/>
+      <w:numFmt w:val="decimal"/>
+      <w:lvlText w:val="%7."/>
+      <w:lvlJc w:val="left"/>
+      <w:pPr>
+        <w:tabs>
+          <w:tab w:val="num" w:pos="5040"/>
+        </w:tabs>
+        <w:ind w:left="5040" w:hanging="360"/>
+      </w:pPr>
+    </w:lvl>
+    <w:lvl w:ilvl="7" w:tentative="1">
+      <w:start w:val="1"/>
+      <w:numFmt w:val="decimal"/>
+      <w:lvlText w:val="%8."/>
+      <w:lvlJc w:val="left"/>
+      <w:pPr>
+        <w:tabs>
+          <w:tab w:val="num" w:pos="5760"/>
+        </w:tabs>
+        <w:ind w:left="5760" w:hanging="360"/>
+      </w:pPr>
+    </w:lvl>
+    <w:lvl w:ilvl="8" w:tentative="1">
+      <w:start w:val="1"/>
+      <w:numFmt w:val="decimal"/>
+      <w:lvlText w:val="%9."/>
+      <w:lvlJc w:val="left"/>
+      <w:pPr>
+        <w:tabs>
+          <w:tab w:val="num" w:pos="6480"/>
+        </w:tabs>
+        <w:ind w:left="6480" w:hanging="360"/>
+      </w:pPr>
+    </w:lvl>
+  </w:abstractNum>
   <w:num w:numId="1" w16cid:durableId="1378889926">
-    <w:abstractNumId w:val="3"/>
+    <w:abstractNumId w:val="4"/>
   </w:num>
   <w:num w:numId="2" w16cid:durableId="352541001">
-    <w:abstractNumId w:val="4"/>
+    <w:abstractNumId w:val="6"/>
   </w:num>
   <w:num w:numId="3" w16cid:durableId="1945263934">
-    <w:abstractNumId w:val="2"/>
+    <w:abstractNumId w:val="3"/>
   </w:num>
   <w:num w:numId="4" w16cid:durableId="1821461352">
     <w:abstractNumId w:val="1"/>
   </w:num>
   <w:num w:numId="5" w16cid:durableId="1533884344">
     <w:abstractNumId w:val="0"/>
+  </w:num>
+  <w:num w:numId="6" w16cid:durableId="1257402659">
+    <w:abstractNumId w:val="8"/>
+  </w:num>
+  <w:num w:numId="7" w16cid:durableId="1675719572">
+    <w:abstractNumId w:val="5"/>
+  </w:num>
+  <w:num w:numId="8" w16cid:durableId="492768043">
+    <w:abstractNumId w:val="9"/>
+  </w:num>
+  <w:num w:numId="9" w16cid:durableId="276330655">
+    <w:abstractNumId w:val="2"/>
+  </w:num>
+  <w:num w:numId="10" w16cid:durableId="956790559">
+    <w:abstractNumId w:val="7"/>
   </w:num>
 </w:numbering>
 </file>

</xml_diff>